<commit_message>
Re-transcribe pages 6 to 15 from scratch
</commit_message>
<xml_diff>
--- a/kata-upanishad.docx
+++ b/kata-upanishad.docx
@@ -560,15 +560,15 @@
         <w:spacing w:line="276" w:lineRule="auto" w:after="120"/>
       </w:pPr>
       <w:r>
-        <w:t>ಇಲ್ಲಿ ಪ್ರಶ್ನ ಕೇಳಿ ಯಮನ ಬಳಿ ಬರುವ ಬಾಲಕನ ಹೆಸರು 'ನಚಿಕೇತ'. ನಚಿಕೇತ ಎನ್ನುವ ಶಬ್ದದ ಅರ್ಥ – ನ ಇಂಚಿ ನಚಿಕೇತಃ ಇತಿ ನಚಿಕೇತಃ. ಅಂದರೆ ಏನೂ ಮಾಡದವನು ಎಂದರ್ಥ! ಈ ಅರ್ಥವನ್ನು ಕೇಳಿ ನಮಗೆ ಆಶ್ಚರ್ಯವಾಗಬಹುದು. ಏನೂ ಮಾಡದವನಿಗೆ ಯಮನೇ ಉಪದೇಶಿಸಿಕೊಟ್ಟ? ಈ ಪ್ರಶ್ನಕ್ಕೆ ಉತ್ತರವೇ ಸಿಗಲಾದರೆ ಯಾವ ನಚಿಕೇತನ ಚರಿತ್ರವನ್ನು ಅರಿಯಲೇ ಬೇಕಾಗುತ್ತೆ. ರಾಜಶ್ರವಸನ ಮಗಳು ಅರುಣಾ. ಅರುಣಿಯ ಮಗವಾದ ಉದ್ದಾಲಕ ಎನ್ನುವ ಋಷಿಯ ಕುಟುಂಬದಲ್ಲಿ ಹುಟ್ಟಿದವನು ನಚಿಕೇತ. ಉದ್ದಾಲಕ ಮಹಾಜ್ಞಾನಿ. ಆದರೆ ಆತನು ತನ್ನ ಮನಸಿನಲ್ಲಿ ಕಾಮ-ಕ್ರೋಧ-ಮೋಹವನ್ನು ಪರಿಪೂರ್ಣವಾಗಿ ಹೋಗಲಾಡಿಸಿದರೂ ಹೋಗಲಾಡಿಸಲಾಗಲಿಲ್ಲ. ಈ ಕಾರಣದಿಂದ ಆತನು ತಪಸ್ಸನ್ನು ಮಾಡುತ್ತಿದ್ದ. ಆತನಿಗೆ ಇಬ್ಬರು ಮಕ್ಕಳು. ಮೊದಲನೆಯವನು ಶ್ವೇತಕೇತು ಹಾಗೂ ಎರಡನೆಯವನು ನಚಿಕೇತ. ಚಿಕ್ಕವನಿರುವಾಗ ನಚಿಕೇತ ಬಹಳ ಪ್ರಶ್ನಗಳ ಶೀಲವಾಗಿದ್ದ. ಸಾಮಾನ್ಯವಾಗಿ ಆತನ ತಂದೆ-ತಾಯಿ ಆತನ ಅಂತರಂಗದ ಒಳವರಿಯನ್ನು ಗುರುತಿಸಲಿಲ್ಲ. ಏನೂ ಮಾಡದವನಿದ್ದನೆಂದು ಭಾವಿಸಿ ಆತನನ್ನು ಗುರುಕುಲಕ್ಕೆ ಕಳುಹಿಸಲೇ, ಮನೆಯಲ್ಲೇ ಇಟ್ಟುಕೊಂಡರು. ಅವಮಾನದಿಂದ ವಂಚಿತವಾದ ನಚಿಕೇತ ಮನೆಯಲ್ಲೇ ತಂದೆಯ ಸೇವೆಯನ್ನು ಹಾಕಿಕೊಂಡಿದ್ದ. ಇಂತಹ ನಚಿಕೇತನೇ ಈ ಉಪನಿಷತ್ತಿನ ಒಬ್ಬ ಋಷಿ (ಶಿಷ್ಯ) ಹಾಗೂ ಯಮ ಉಪದೇಶಿಸಿದ ಇನ್ನೊಬ್ಬ ಋಷಿ (ಗುರು).</w:t>
-      </w:r>
-    </w:p>
-    <w:p>
-      <w:pPr>
-        <w:spacing w:line="276" w:lineRule="auto" w:after="120"/>
-      </w:pPr>
-      <w:r>
-        <w:t>ಬನ್ನಿ, ಜೀವರೂಪಕವಾದ ಭಗವಂತನ ಕೊಡುಗೆಯಾದ ಈ ಕೃತಿಯನ್ನು, ಆ ಭಗವಂತನ ಅನುಗ್ರಹದಿಂದಲೇ ನಮಗೆ ತಿಳಿದಷ್ಟನ್ನು ಅಧ್ಯಯನಿಸಲು ಪ್ರಯತ್ನಿಸೋಣ.</w:t>
+        <w:t>ಇಲ್ಲಿ ಪ್ರಶ್ನೆ ಹಾಕುವ ಬಾಲಕನ ಹೆಸರು ‘ನಚಿಕೇತ’. ನಚಿಕೇತ ಎನ್ನುವ ಶಬ್ದದ ಅರ್ಥ - ನ ಕಿಂಚಿತ್ ಚಿಕೇತಃ ಇತಿ ನಚಿಕೇತಃ. ಅಂದರೆ ಏನೂ ಮಾಡದವನು ಎಂದರ್ಥ! ಈ ಅರ್ಥವನ್ನು ಕೇಳಿ ನಿಮಗೆ ಆಶ್ಚರ್ಯವಾಗಬಹುದು. ಏನೂ ಮಾಡದವನಿಗೆ ಯಮನೇ ಏಕೆ ಉಪದೇಶಕೊಟ್ಟ? ಈ ಪ್ರಶ್ನೆಗೆ ಉತ್ತರ ಸಿಗಬೇಕಾದರೆ ನಾವು ನಚಿಕೇತನ ಹಿನ್ನೆಲೆಯನ್ನು ತಿಳಿಯಬೇಕಾಗುತ್ತದೆ. ವಾಜಶ್ರವಸ್ಸಿನ ಮಗಳು ಅರುಣಾ. ಅರುಣೆಯ ಮಗನಾದ ಉದ್ದಾಲಕ ಎನ್ನುವ ಋಷಿ ಕುಟುಂಬದಲ್ಲಿ ಹುಟ್ಟಿಬಂದವ ನಚಿಕೇತ. ಉದ್ದಾಲಕ ಮಹಾಜ್ಞಾನಿ. ಆದರೆ ಆತ ತನ್ನ ಮನಸ್ಸಿನ ಕಾಮ-ಕ್ರೋಧ-ಮೋಹವನ್ನು ಪೂರ್ತಿ ಬಿಡಲಾಗದೆ ಲೋಭಿಯಾಗಿದ್ದ. ಈ ಕಾರಣದಿಂದ ಆತ ತಪ್ಪು ಮಾಡುತ್ತಿದ್ದ. ಆತನಿಗೆ ಇಬ್ಬರು ಮಕ್ಕಳು. ಮೊದಲನೆಯವ ಶ್ವೇತಕೇತು ಹಾಗೂ ಎರಡನೆಯವ ನಚಿಕೇತ. ಚಿಕ್ಕವನಿದ್ದಾಗ ನಚಿಕೇತ ಬಹಳ ಮೌನಿಯಾಗಿದ್ದ. ಹಾಗಾಗಿ ಆತನ ತಂದೆ-ತಾಯಿ ಆತನ ಅಂತರಂಗದ ಬೆಳವಣಿಗೆಯನ್ನು ಗುರುತಿಸಲಿಲ್ಲ. ಏನೂ ಮಾಡದವನೆಂದು ತಿಳಿದು ಆತನನ್ನು ಗುರುಕುಲಕ್ಕೆ ಕಳುಹಿಸದೇ, ಮನೆಯಲ್ಲೇ ಇರಿಸಿಕೊಂಡರು. ಶಿಕ್ಷಣದಿಂದ ವಂಚಿತನಾದ ನಚಿಕೇತ ಮನೆಯಲ್ಲಿ ತಂದೆ ತಾಯಿ ಚಾಕರಿ ಮಾಡಿಕೊಂಡಿದ್ದ. ಇಂತಹ ನಚಿಕೇತನೇ ಈ ಉಪನಿಷತ್ತಿನ ಒಬ್ಬ ಋಷಿ(ಶಿಷ್ಯ) ಹಾಗೂ ಯಮ ಉಪದೇಶ ಮಾಡಿದ ಇನ್ನೊಬ್ಬ ಋಷಿ(ಗುರು).</w:t>
+      </w:r>
+    </w:p>
+    <w:p>
+      <w:pPr>
+        <w:spacing w:line="276" w:lineRule="auto" w:after="120"/>
+      </w:pPr>
+      <w:r>
+        <w:t>ಬನ್ನಿ, ಮೋಕ್ಷ ನಿಯಾಮಕನಾದ ಭಗವಂತನ ಕುರಿತಾಗಿರುವ ಈ ಕೃತಿಯನ್ನು ಆ ಭಗವಂತನ ಅನುಗ್ರಹ ಬೇಡಿ ನಮ್ಮ ಯೋಗ್ಯತೆ ಇದ್ದಷ್ಟು ಅರಿಯಲು ಪ್ರಯತ್ನಿಸೋಣ.</w:t>
       </w:r>
     </w:p>
     <w:p>
@@ -584,7 +584,7 @@
         <w:spacing w:line="276" w:lineRule="auto" w:after="120"/>
       </w:pPr>
       <w:r>
-        <w:t>Visit Us at: http://kathopanishat.blogspot.in/</w:t>
+        <w:t>Visit Us at : http://kathopanishat.blogspot.in/</w:t>
       </w:r>
     </w:p>
     <w:p>
@@ -597,7 +597,7 @@
           <w:i/>
           <w:sz w:val="20"/>
         </w:rPr>
-        <w:t>ಆಧಾರ: ಬನ್ನಂಜೆ ಗೋವಿಂದಾಚಾರ್ಯ ಉಪನಿಷತ್ ಪ್ರವಚನ    Page 5</w:t>
+        <w:t>ಆಧಾರ: ಬನ್ನಂಜೆ ಗೋವಿಂದಾಚಾರ್ಯರ ಉಪನಿಷತ್ ಪ್ರವಚನ Page 5</w:t>
       </w:r>
     </w:p>
     <w:p>
@@ -648,15 +648,15 @@
         <w:spacing w:line="276" w:lineRule="auto" w:after="120"/>
       </w:pPr>
       <w:r>
-        <w:t>ಓ ಭಗವಂತ- ನೀನು ಗುರು-ಶಿಷ್ಯರಾದ ನಮ್ಮನ್ನು ಒಟ್ಟಿಗೆ ಜೊತೆಯಲ್ಲಿ, ಕಾಪಾಡಿ ಪೋಷಿಸು. ನಮಗೆ ಈ ಅಧ್ಯಯನ ಮಾಡುವ ಸಾಮರ್ಥ್ಯವನ್ನು ಕೊಡು. ಈ ಅಧ್ಯಯನದಿಂದ ನಾವು ತೇಜಸ್ವಿಗಳಾಗುವಂತೆ ಮಾಡು. ನಾವೆಂದೂ ಪರಸ್ಪರ ದ್ವೇಷ ಮಾಡದೆ ಇರುವಂತೆ ರಕ್ಷಿಸು. ಓಂಕಾರ ವಾಚ್ಯ ಮತ್ತು ಮೋಕ್ಷಸ್ವರೂಪಕವಾದ ನೀನು ಜ್ಞಾನಾನಂದಗಳ ತುತ್ತ ತ್ತೆಂದು ಪರಮಾತ್ಮ.</w:t>
-      </w:r>
-    </w:p>
-    <w:p>
-      <w:pPr>
-        <w:spacing w:line="276" w:lineRule="auto" w:after="120"/>
-      </w:pPr>
-      <w:r>
-        <w:t>(ಪ್ರಣ ವಿವರಣೆಯನ್ನು ಕೊನೆಯ ವಲ್ಲಿಯಲ್ಲಿ ನೀಡಲಾಗಿದೆ)</w:t>
+        <w:t>ಓ ಭಗವಂತ- ನೀನು ಗುರುಶಿಷ್ಯರಾದ ನಮ್ಮನ್ನು ಜೊತೆಯಲ್ಲಿ ಕಾಪಾಡಿ ಪೋಷಿಸು. ನಮಗೆ ಈ ಅಧ್ಯಯನ ಮಾಡುವ ಸಾಮರ್ಥ್ಯವನ್ನು ಕೊಡು. ಈ ಅಧ್ಯಯನದಿಂದ ನಾವು ತೇಜಸ್ವಿಗಳಾಗುವಂತೆ ಮಾಡು. ನಾವೆಂದೂ ಪರಸ್ಪರ ದ್ವೇಷಮಾಡದೆ ಇರುವಂತೆ ರಕ್ಷಿಸು. ಓಂಕಾರ ವಾಚ್ಯ ಮತ್ತು ಮೋಕ್ಷನಿಯಾಮಕನಾದ ನೀನು ಜ್ಞಾನಾನಂದಗಳ ತುತ್ತತುದಿ.</w:t>
+      </w:r>
+    </w:p>
+    <w:p>
+      <w:pPr>
+        <w:spacing w:line="276" w:lineRule="auto" w:after="120"/>
+      </w:pPr>
+      <w:r>
+        <w:t>(ಪೂರ್ಣ ವಿವರಣೆಯನ್ನು ಕೊನೆಯ ವಲ್ಲಿಯಲ್ಲಿ ನೀಡಲಾಗಿದೆ)</w:t>
       </w:r>
     </w:p>
     <w:p>
@@ -669,7 +669,7 @@
           <w:i/>
           <w:sz w:val="20"/>
         </w:rPr>
-        <w:t>ಆಧಾರ: ಬನ್ನಂಜೆ ಗೋವಿಂದಾಚಾರ್ಯ ಉಪನಿಷತ್ ಪ್ರವಚನ    Page 6</w:t>
+        <w:t>ಆಧಾರ: ಬನ್ನಂಜೆ ಗೋವಿಂದಾಚಾರ್ಯರ ಉಪನಿಷತ್ ಪ್ರವಚನ Page 6</w:t>
       </w:r>
     </w:p>
     <w:p>
@@ -744,15 +744,15 @@
         <w:spacing w:line="276" w:lineRule="auto" w:after="120"/>
       </w:pPr>
       <w:r>
-        <w:t>ವಾಜಶ್ರವಸ್ಸು ಎನ್ನುವ ಋಷಿಯ ಮಗಳು ಅರುಣಾ. ಈ ಅರುಣೆಯ ಮಗ ಉದ್ದಾಲಕ.(ಈತನನ್ನು ಔದ್ದಾಲಕಿ ಆರುಣಾ ಎಂದೂ ಕರೆಯುತ್ತಾರೆ.) ಈತನಿಗೆ ಶ್ವೇತಕೇತು ಮತ್ತು ನಚಿಕೇತ ಎನ್ನುವ ಇಬ್ಬರು ಪುತ್ರರಿದ್ದರು.[ಈ ಶ್ಲೋಕದಲ್ಲಿ, 'ವಾಜಶ್ರವಸಃ' ಎನ್ನುವುದನ್ನು ಅನುವಾದಕಾರರು ಸಾಮಾನ್ಯವಾಗಿ 'ವಾಜಶ್ರವಸ್ಸಿನ ಮಗ-ನಚಿಕೇತ' ಎಂದು ತಪ್ಪಾಗಿ ಅನುವಾದಿಸುವದನ್ನು ಕಾಣುತ್ತೇವೆ. ಆದರೆ ಅದು ಸರಿಯಲ್ಲ. ] ತತ್ಕಾಲಿಕ, ಭ್ರಷ್ಟ, ಅನ್ಯದಾಕ್ಕಿನ ಹೆಸರಾದ ವಾಜಶ್ರವಸ್ಸಿನ ಕುಟುಂಬದಲ್ಲಿ ಹುಟ್ಟಿಕೊಂಡ ಉದ್ದಾಲಕ, ಸಮಗ್ರ ಶಾಸ್ತ್ರಜ್ಞನಾಗಿದ್ದ. ಜ್ಞಾನಿಯಾಗಿದ್ದ ಈತ ಸ್ವರ್ಗದ 'ಬಯಕೆ'ಯಿಂದ ಒಂದು ಯಜ್ಞ ಮಾಡಿದ. ಮಹಾನ್ ಜ್ಞಾನಿಯಾಗಿಯೂ ಫಲಾಪೇಕ್ಷೆಯಿಂದ ಕರ್ಮ ಮಾಡುವದನ್ನು ಈ ಶ್ಲೋಕದಲ್ಲಿ "ಹ ವೈ" ಎನ್ನುವ ಆಶ್ಚರ್ಯಸೂಚಕವಾಗಿ ಪ್ರಸ್ತುತಪಡಿಸಲಾಗಿದೆ. ಶಾಸ್ತ್ರಕಾರರು ಹೇಳುವಂತೆ ನಾವು ಯಾವುದೇ ಯೋಚಿಯನ್ನಾಗಲಿ ಅಲ್ಲ ಫಲದ ಅಸೆಯಿಂದ ಮಾಡದೇ ಭಗವದ್ ಪ್ರೀತ್ಯರ್ಥವಾಗಿ ಮಾಡಬೇಕು. ಭಗವದ್ ಪ್ರೀತ್ಯರ್ಥವಾಗಿ ಮಾಡುವ ಕರ್ಮ ಎಲ್ಲಾ ಫಲಗಳನ್ನೊಳಗೊಂಡ 'ಭಗವಂತನ ಅನುಗ್ರಹ' ಎನ್ನುವ ಮಹಾಫಲವನ್ನು ಕೊಡುವಾಗ, ಅಲ್ಲ ಫಲದ ಅಸೆಯಿಂದ ಮಾಡಿದರೆ ಮಹಾಫಲವನ್ನು ಕಳೆದುಕೊಂಡಂತೆ. ಇಲ್ಲ, ಜ್ಞಾನಿಯಾಗಿದ್ದ ಉದ್ದಾಲಕ ನಿಷ್ಕಾಮಕರ್ಮ ಮಾಡುವದನ್ನು ಬಿಟ್ಟು, ಆಶ್ಚರ್ಯವೆಂಬಂತೆ ಫಲವನ್ನು ಬಯಸಿ 'ಸರ್ವವೇದ' ಎನ್ನುವ ಯಜ್ಞ ಮಾಡಿದ. 'ವೇದ' ಎಂದರೆ 'ಸಂಪತ್ತು'. 'ಸರ್ವವೇದ' ಎಂದರೆ ತನ್ನಲ್ಲಿರುವ ಸಮಸ್ತವನ್ನೂ ದಾನ ಮಾಡುವದು. ಉದ್ದಾಲಕ ಇಂತಹ ಮಹಾನ್ ಯಜ್ಞವನ್ನು ಮಾಡುತ್ತಾಗಲೂ ಕೂಡಾ ಲೋಭತನದಿಂದ ಮಾಡಿದ!</w:t>
-      </w:r>
-    </w:p>
-    <w:p>
-      <w:pPr>
-        <w:spacing w:line="276" w:lineRule="auto" w:after="120"/>
-      </w:pPr>
-      <w:r>
-        <w:t>ತꣳ ಹ ಕುಮಾರꣳ ಸಂತಂ ದಕ್ಷಿಣಾಸು ನೀಯಮಾನಾಸು</w:t>
+        <w:t>ವಾಜಶ್ರವಸ್ಸು ಎನ್ನುವ ಋಷಿಯ ಮಗಳು ಅರುಣಿ. ಈ ಅರುಣೆಯ ಮಗ ಉದ್ದಾಲಕ.(ಈತನನ್ನು ಔದ್ದಾಲಕಿ ಆರುಣಿ ಎಂದೂ ಕರೆಯುತ್ತಾರೆ.) ಈತನಿಗೆ ಶ್ವೇತಕೇತು ಮತ್ತು ನಚಿಕೇತ ಎನ್ನುವ ಇಬ್ಬರು ಪುತ್ರರಿದ್ದರು.[ಈ ಶ್ಲೋಕದಲ್ಲಿ ‘ವಾಜಶ್ರವಸಃ’ ಎನ್ನುವುದನ್ನು ಅನುವಾದಕಾರರು ಸಾಮಾನ್ಯವಾಗಿ ‘ವಾಜಶ್ರವಸ್ಸಿನ ಮಗ-ನಚಿಕೇತ’ ಎಂದು ತಪ್ಪಾಗಿ ಅನುವಾದಿಸುವುದನ್ನು ಕಾಣುತ್ತೇವೆ. ಆದರೆ ಅದು ಸರಿಯಲ್ಲ. ] ತತ್ವಚಿಂತನೆ, ಜಿಜ್ಞಾಸೆ, ಅನ್ನದಾನಕ್ಕೆ ಹೆಸರಾದ ವಾಜಶ್ರವಸ್ಸಿನ ಕುಟುಂಬದಲ್ಲಿ ಹುಟ್ಟಿಬೆಳೆದ ಉದ್ದಾಲಕ, ಸಮಗ್ರ ಶಾಸ್ತ್ರಜ್ಞನಾಗಿದ್ದ. ಜ್ಞಾನಿಯಾಗಿದ್ದ ಈತ ಸ್ವರ್ಗದ ‘ಬಯಕೆ’ಯಿಂದ ಒಂದು ಯಜ್ಞ ಮಾಡಿದ. ಮಹಾನ್ ಜ್ಞಾನಿಯೊಬ್ಬ ಫಲಾಪೇಕ್ಷೆಯಿಂದ ಕರ್ಮ ಮಾಡುವುದನ್ನು ಈ ಶ್ಲೋಕದಲ್ಲಿ “ಹ ವೈ” ಎನ್ನುವಲ್ಲಿ ಆಶ್ಚರ್ಯಸೂಚಕವಾಗಿ ಪ್ರಸ್ತುತಪಡಿಸಲಾಗಿದೆ. ಶಾಸ್ತ್ರಕಾರರು ಹೇಳುವಂತೆ ನಾವು ಯಾವುದೇ ಪೂಜೆಯನ್ನಾಗಲಿ ಅಲ್ಪಫಲದ ಆಸೆಯಿಂದ ಮಾಡದೇ ಭಗವದ್ ಪ್ರೀತ್ಯರ್ಥವಾಗಿ ಮಾಡಬೇಕು. ಭಗವದ್ ಪ್ರೀತ್ಯರ್ಥವಾಗಿ ಮಾಡುವ ಕರ್ಮ ಎಲ್ಲಾ ಫಲಗಳನ್ನೊಳಗೊಂಡ ‘ಭಗವಂತನ ಅನುಗ್ರಹ’ ಎನ್ನುವ ಮಹಾಫಲವನ್ನು ಕೊಡುವಾಗ, ಅಲ್ಪ ಫಲದ ಆಸೆಯಿಂದ ಪೂಜೆ ಮಾಡಿದರೆ ಮಹಾಫಲವನ್ನು ಕಳೆದುಕೊಂಡಂತೆ. ಇಲ್ಲಿ ಜ್ಞಾನಿಯಾಗಿದ್ದ ಉದ್ದಾಲಕ ನಿಷ್ಕಾಮಕರ್ಮ ಮಾಡುವುದನ್ನು ಬಿಟ್ಟು, ಆಶ್ಚರ್ಯವೆಂಬಂತೆ ಫಲವನ್ನು ಬಯಸಿ ‘ಸರ್ವವೇದಸ್’ ಎನ್ನುವ ಯಜ್ಞ ಮಾಡಿದ. ‘ವೇದಸ್’ ಎಂದರೆ ‘ಸಂಪತ್ತು’. ‘ಸರ್ವವೇದಸ್’ ಎಂದರೆ ತನ್ನಲ್ಲಿರುವ ಸರ್ವಸ್ವವನ್ನೂ ದಾನ ಮಾಡುವುದು. ಉದ್ದಾಲಕ ಇಂತಹ ಮಹಾನ್ ಯಜ್ಞವನ್ನು ಮಾಡುವಾಗಲೂ ಕೂಡಾ ಲೋಭತನದಿಂದ ಮಾಡಿದ!</w:t>
+      </w:r>
+    </w:p>
+    <w:p>
+      <w:pPr>
+        <w:spacing w:line="276" w:lineRule="auto" w:after="120"/>
+      </w:pPr>
+      <w:r>
+        <w:t>ತಂ ಹ ಕುಮಾರಂ ಸಂತಂ ದಕ್ಷಿಣಾಸು ನೀಯಮಾನಾಸು</w:t>
       </w:r>
     </w:p>
     <w:p>
@@ -789,7 +789,7 @@
           <w:i/>
           <w:sz w:val="20"/>
         </w:rPr>
-        <w:t>ಆಧಾರ: ಬನ್ನಂಜೆ ಗೋವಿಂದಾಚಾರ್ಯ ಉಪನಿಷತ್ ಪ್ರವಚನ    Page 7</w:t>
+        <w:t>ಆಧಾರ: ಬನ್ನಂಜೆ ಗೋವಿಂದಾಚಾರ್ಯರ ಉಪನಿಷತ್ ಪ್ರವಚನ Page 7</w:t>
       </w:r>
     </w:p>
     <w:p>
@@ -816,15 +816,15 @@
         <w:spacing w:line="276" w:lineRule="auto" w:after="120"/>
       </w:pPr>
       <w:r>
-        <w:t>ಸಾಮಾನ್ಯವಾಗಿ ಕಾಡಿನಲ್ಲಿ ಹಾಸಿಬಿಡ ಯಜ್ಞಿಗಳ ಸಂಪತ್ತು-ಹಸುಗಳು. ಲೋಭದಿಂದ ಹಸುಗಳನ್ನು ಒಳ್ಳೆಯ ಹಸುಗಳನ್ನು ಬಿಟ್ಟು, ಕೊಡಲು ಹಸುಗಳನ್ನು ಉದ್ದಾಲಕ ದಾನ ಮಾಡುತ್ತಿದ್ದ. ಈ ದೃಶ್ಯವನ್ನು ಹೊರ ನೋಟಕ್ಕೆ ಮಂದಿ ಬುದ್ಧಿಯವನಂತೆ ಕಾಣುವ [ಪಿಣಿಚ?]-ಆತನ ಮಗ ನಚಿಕೇತ ನೋಡುತ್ತಿದ್ದ. ಮಹಾತ್ಮನಾದ ಆತನ ತಂದೆ ಮಾಡುತ್ತಿರುವ ತಪ್ಪಿನ ಅರಿವಾಗುತ್ತೆ. ಯಜ್ಞವೆಂಬ ಮಹಾಮಾಯೆ ಅಂಥ ತನ್ನನ್ನು ಲೋಭವಶವಾಗಿ ರುವ ತಂದೆ ಅಪಾಪ ಯಾವನ್ನು ಮಾಡುವದನ್ನು ಕಂಡು ಆತ ಮರುಗುತ್ತಾನೆ. ಈ ಹಿತಿ ದಾನ ಮಾಡಿವದಿಂದ ಪಾಪಕ ಬರುತ್ತೆ ಎಂದು ಹೇಳುವ ಬದಲು "ನನ್ನನ್ನು ಯಾಯಾದರೂ ದಾನ ಮಾಡು" ಎಂದು ಹೇಳುವದಕ್ಕಾಗಿ ಆತ ತಂದೆಯ ಬಳಿ ಹೋಗುತ್ತಾನೆ.</w:t>
-      </w:r>
-    </w:p>
-    <w:p>
-      <w:pPr>
-        <w:spacing w:line="276" w:lineRule="auto" w:after="120"/>
-      </w:pPr>
-      <w:r>
-        <w:t>ಸ ಹೋವಾಚ ಪಿತರಂ ತಾತ ಕಸ್ಮೈ ಮಾಂ ದಾಸ್ಯಸೀತಿ |</w:t>
+        <w:t>ಸಾಮಾನ್ಯವಾಗಿ ಕಾಡಿನಲ್ಲಿ ವಾಸಿಸುವ ಋಷಿಗಳ ಸಂಪತ್ತು-ಹಸುಗಳು. ಲೋಭದಿಂದಾಗಿ ಹಸುಗಳಲ್ಲಿ ಒಳ್ಳೆಯ ಹಸುಗಳನ್ನು ಬಿಟ್ಟು ಗೋಡು ಹಸುಗಳನ್ನು ಉದ್ದಾಲಕ ದಾನ ಮಾಡುತ್ತಿದ್ದ. ಈ ದೃಶ್ಯವನ್ನು ಹೊರನೋಟಕ್ಕೆ ಮಂದ ಬುದ್ಧಿಯವನಂತೆ ಕಾಣುವ ಪುಣ್ಯಜೀವಿ-ಆತನ ಮಗ ನಚಿಕೇತ ನೋಡುತ್ತಿದ್ದ. ಮಹಾತ್ಮನಾದ ಆತನಿಗೆ ತನ್ನ ತಂದೆ ಮಾಡುತ್ತಿರುವ ತಪ್ಪಿನ ಅರಿವಾಗುತ್ತದೆ. ಯಜ್ಞವೆಂಬ ಮಹತ್ಕಾರ್ಯ ಮಾಡಿ ಅಲ್ಲಿ ತನ್ನ ಲೋಭಕ್ಕೆ ವಶವಾಗಿರುವ ತಂದೆ ಅನ್ಯಾಯವಾಗಿ ಪಾಪ ಕಾರ್ಯವನ್ನು ಮಾಡುವುದನ್ನು ಕಂಡು ಆತ ಮರುಗುತ್ತಾನೆ. ಚಿಕ್ಕವನಾದ್ದರಿಂದ ಆತನಿಗೆ ತಂದೆಗೆ ಬುದ್ಧಿವಾದ ಹೇಳಲು ಸಾಧ್ಯವಾಗುವುದಿಲ್ಲ. ಈ ರೀತಿ ದಾನ ಮಾಡಿದ್ದರಿಂದ ಪಾಪ ಬರುತ್ತದೆ ಎಂದು ಹೇಳುವ ಬದಲು “ನನ್ನನ್ನು ಯಾರಿಗಾದರೂ ದಾನ ಮಾಡು” ಎಂದು ಹೇಳುವುದಕ್ಕಾಗಿ ಆತ ತಂದೆಯ ಬಳಿ ಹೋಗುತ್ತಾನೆ.</w:t>
+      </w:r>
+    </w:p>
+    <w:p>
+      <w:pPr>
+        <w:spacing w:line="276" w:lineRule="auto" w:after="120"/>
+      </w:pPr>
+      <w:r>
+        <w:t>ಸ ಹೋವಾಚ ಪಿತರಂ ತತ ಕಸ್ಮೈ ಮಾಂ ದಾಸ್ಯಸೀತಿ |</w:t>
       </w:r>
     </w:p>
     <w:p>
@@ -840,7 +840,7 @@
         <w:spacing w:line="276" w:lineRule="auto" w:after="120"/>
       </w:pPr>
       <w:r>
-        <w:t>ತಂದೆಯ ಬಳಿ ಹೋದ ನಚಿಕೇತ ಹೇಳುತ್ತಾನೆ: "ಅಪ್ಪಾ, ಇದು ಸರ್ವಸ್ವವನ್ನೂ ದಾನ ಮಾಡುವ ಯಜ್ಞವಾಗಿರುವದಿಂದ ನನ್ನನ್ನು ಯಾರಿಗಾದರೂ ದಾನ ಮಾಡು. ನಾನು ಅವರ ಮನೆಯ ಚಾಕರಿ ಮಾಡಿಕೊಂಡು ಇದನ್ನು ತಡಿಕೊಳ್ಳೇನೆ. ನನ್ನನ್ನು ದಾನ ಮಾಡಿದುದರ ಫಲ ನಿನಗೆ ಬರುತ್ತೆ" ಎಂದು. ಈಗಿಂತ ಮೊದಮೊದಲು ನಚಿಕೇತನನ್ನು ಆತನ ತಂದೆ-ಯಾರಾ ಒಬ್ಬ ಬುದ್ಧಿಗೇಡದ ಮಗನಾಗಿ ಕಾಣುತ್ತಿದ್ದರು. ಆದರಿಂದ ಇಲ್ಲಿ ಆತನ ಮಾತನ್ನು ಉದ್ದಾಲಕ ಗೊಡವೆ ಗಾಯಿಸಲಿಲ್ಲದ. ತನ್ನನ್ನು ಗಮನಿಸದ ತಂದೆಯ ಬಳಿ ನಚಿಕೇತ: "ನನ್ನನ್ನು ದಾನ ಮಾಡು ಕೊಡು ಏಯ ಅಪ್ಪಾ" ಎಂದು ಎರಡನೇ ಬಾರಿ ಹೇಳುತ್ತಾನೆ. ಇದನ್ನೂ ಉದ್ದಾಲಕ ಅಲಕ್ಕಿಸದಿದ್ದಾಗ, ನಚಿಕೇತ ಮೂರನೇ ಬಾರಿ: "ಅಪ್ಪಾ-ನನ್ನನ್ನು ದಾನ ಮಾಡ ಕೊಡು. ಏಯ" ಎಂದು ಹೇಳುತ್ತಾನೆ. ಮಗ ಮೂರನೇ ಬಾರಿ ಈ ರೀತಿ ಹೇಳಿದಾಗ ಉದ್ದಾಲಕ ಕೋಪ ಬರುತ್ತೆ. ಕೋಪದಿಂದ ಬರಿದಾ ಆತ ಹೇಳುತ್ತಾನೆ: "ಮೃತ್ಯವೇ ತ್ವಾ ದದಾಮಿ" ಎಂದು. ಅಂದ "ಇನ್ನು ಮೃತ್ಯು (ಯಮ) ಹೋಗೇ" ಎಂದು. ಮೃತ್ಯು ಈ ಸ್ಥೂಲ ಶರೀರದಿಂದ ಹೋಗಲು ಸಾಧ್ಯವಿಲ್ಲ. ದೇಹದ ನೊಟ್ಟ ಅಷ್ಟೇ ಹೊರತನ್ನ ಸೂಕ್ಷ್ಮ ಶರೀರದಿಂದ ಮಾತ್ರ ಸೂಕ್ಷ್ಮಲೋಕ ಪಯಣದ ಸಾಧ್ಯವು. ನಮ್ಮ ಪಕ್ಕದಿ ಬಳಕಿನ ಶರೀರದ ಒಳಗೂ ಒಂದು ಸೂಕ್ಷ್ಮ ಶರೀರವಿದೆ. ಅದನ್ನು ಅನಿರುದ್ಧ ಶರೀರ ಎನ್ನುತ್ತಾರೆ. ಮನಃಶಾಸ್ತ್ರದವರು ಇದನ್ನು Aerial Body ಎಂದು ಕರೆಯುತ್ತಾರೆ. ಸ್ಥೂಲ ದೇಹದಿಂದ ಯಾರಿಗೂ ಸೂಕ್ಷ್ಮಲೋಕವನ್ನು ಕಾಣಲು ಸಾಧ್ಯವಿಲ್ಲ ಆದರಿಂದ ಇಲ್ಲಿ ಉದ್ದಾಲಕ ಹೇಳಿರುವ ಮಾತು 'ನೀನು ಸತ್ತು ಹೋಗು' ಎನ್ನುವ ಮಹಾಪಾಪ! ತಂದೆಯ ಮಾತಿಂದ 'ಮರಿ ಹೋಗಬೇಕು' ಎನ್ನುವ ಆದೇಶ ಬಂದಾಗ ನಚಿಕೇತ ಅದನ್ನು ಪಾಲಿಸಲು ತನ್ನ ಸ್ಥೂಲ ದೇಹವನ್ನು ಬಿಡುಗಡೆ ಮಾಡಿ ಹೊರಟು ಹೋದ. [ಪಾಶ್ಚಾತ್ಯದ ಇಲ್ಲಿನ ಸಮ್ಮೋಹನ ಕ್ರಿಯೆಯನ್ನು (Hypnotism) ಪರಿಚಯಿಸುತ್ತಾ ಗಮನಿಸಿದ ಒಂದು ಘಟನೆ ಈ ರೀತಿಯ ಅನೇಕ ಪರಿಕಲ್ಪಕ್ಕೆ ಸಾಕ್ಷಿ. ಪರಿಚಯದ ಒಂದು ಹಂತದಲ್ಲಿ ಸಮ್ಮೋಹನ ಮಾಡುತ್ತಿದ್ದ ವೈದ್ಯ(hypnotiser) ಮಾತನ್ನು ಸಮ್ಮೋಹನಕ್ಕೆ ಒಳಗಾದ ವ್ಯಕ್ತಿ (person under hypnosis) ತಕ್ಷಣ ಪಾಲಿಸಲಿ. ಆಗ ಕೋಪಗೊಂಡ</w:t>
+        <w:t>ತಂದೆಯ ಬಳಿ ಹೋದ ನಚಿಕೇತ ಹೇಳುತ್ತಾನೆ: “ಅಪ್ಪಾ, ಇದು ಸರ್ವಸ್ವವನ್ನೂ ದಾನ ಮಾಡುವ ಯಜ್ಞವಾಗಿರುವುದರಿಂದ ನನ್ನನ್ನು ಯಾರಿಗಾದರೂ ದಾನ ಮಾಡು. ನಾನು ಅವರ ಮನೆಯ ಚಾಕರಿ ಮಾಡಿಕೊಂಡು ಇದ್ದು ಬಿಡುತ್ತೇನೆ. ನನ್ನನ್ನು ದಾನ ಮಾಡಿದ್ದುದರ ಫಲ ನಿನಗೆ ಬರುತ್ತದೆ” ಎಂದು. ಈ ಹಿಂದೆ ಹೇಳಿದಂತೆ ನಚಿಕೇತನನ್ನು ಆತನ ತಂದೆ-ತಾಯಿ ಒಬ್ಬ ಬುದ್ಧಿಹೀನ ಬಾಲಕ ಎಂದು ತಿಳಿದಿದ್ದರು. ಆದ್ದರಿಂದ ಇಲ್ಲಿ ಆತನ ಮಾತನ್ನು ಉದ್ದಾಲಕ ಕಿವಿಗೊಡದೆ-ನಿರ್ಲಕ್ಷಿಸಿದ. ತನ್ನನ್ನು ಗಮನಿಸದ ತಂದೆಯ ಬಳಿ ನಚಿಕೇತ: “ನನ್ನನ್ನು ಯಾರಿಗೆ ಕೊಡುತ್ತೀಯ ಅಪ್ಪಾ” ಎಂದು ಎರಡನೇ ಬಾರಿ ಕೇಳುತ್ತಾನೆ. ಇದನ್ನೂ ಉದ್ದಾಲಕ ಅಲಕ್ಷಿಸಿದಾಗ, ನಚಿಕೇತ ಮೂರನೇ ಬಾರಿ: “ಅಪ್ಪಾ -ನನ್ನನ್ನು ಯಾರಿಗೆ ದಾನ ಮಾಡುತ್ತೀಯ” ಎಂದು ಕೇಳುತ್ತಾನೆ. ಮಗ ಮೂರನೇ ಬಾರಿ ಈ ರೀತಿ ಕೇಳಿದಾಗ ಉದ್ದಾಲಕನಿಗೆ ಕೋಪ ಬರುತ್ತದೆ. ಕೋಪದ ರಭಸದಲ್ಲಿ ಆತ ಹೇಳುತ್ತಾನೆ: “ಮೃತ್ಯವೇ ತ್ವಾ ದದಾಮಿ” ಎಂದು. ಅಂದರೆ “ನಿನ್ನನ್ನು ಮೃತ್ಯುವಿಗೆ(ಯಮನಿಗೆ) ಕೊಟ್ಟಿದ್ದೇನೆ” ಎಂದು. ಮೃತ್ಯುವಿಗೆ ದಾನ ಕೊಟ್ಟರೆ ಅಲ್ಲಿಗೆ ಈ ಸ್ಥೂಲ ಶರೀರದಿಂದ ಹೋಗಲು ಸಾಧ್ಯವಿಲ್ಲ. ದೇಹ ತ್ಯಜಿಸಿ ಸೂಕ್ಷ್ಮ ಶರೀರಿಯಾಗಿ ಮಾತ್ರ ಸೂಕ್ಷ್ಮಲೋಕ ಪಯಣ ಸಾಧ್ಯ. ನಮ್ಮಲ್ಲಿ ಪ್ರತಿಯೊಬ್ಬರ ಶರೀರದೊಳಗೂ ಒಂದು ಸೂಕ್ಷ್ಮ ಶರೀರವಿದೆ. ಅದನ್ನು ಅನಿರುದ್ಧ ಶರೀರ ಎನ್ನುತ್ತಾರೆ. ಮನಃಶಾಸ್ತ್ರಜ್ಞರು ಇದನ್ನು Aerial Body ಎಂದು ಕರೆಯುತ್ತಾರೆ. ಸ್ಥೂಲ ದೇಹದಿಂದ ನಾವು ಸೂಕ್ಷ್ಮಲೋಕವನ್ನು ಕಾಣಲು ಸಾಧ್ಯವಿಲ್ಲವಾದ್ದರಿಂದ ಇಲ್ಲಿ ಉದ್ದಾಲಕ ಹೇಳಿರುವ ಮಾತು “ನೀನು ಸತ್ತು ಹೋಗು” ಎನ್ನುವ ಶಾಪ! ತಂದೆಯ ಬಾಯಿಯಿಂದ ‘ಸಾಯಬೇಕು’ ಎನ್ನುವ ಆದೇಶ ಬಂದಾಗ ನಚಿಕೇತ ಅದನ್ನು ಪಾಲಿಸಲು ತನ್ನ ಸ್ಥೂಲ ದೇಹವನ್ನು ತ್ಯಾಗಮಾಡಿ ಹೊರಟುಹೋದ. [ವಿದೇಶದಲ್ಲಿ ಇತ್ತೀಚೆಗೆ ಸಮ್ಮೋಹನ ವಿದ್ಯೆಯನ್ನು(Hypnotism) ಪ್ರದರ್ಶಿಸುತ್ತಿದ್ದಾಗ ನಡೆದ ಒಂದು ಘಟನೆ ಈ ಮೇಲಿನ ಕಥೆಗೆ ಪೂರಕ. ಪ್ರದರ್ಶನದ ಒಂದು ಹಂತದಲ್ಲಿ ಸಮ್ಮೋಹನ ಮಾಡುತ್ತಿದ್ದ ವೈದ್ಯನ(hypnotiser) ಮಾತನ್ನು ಸಮ್ಮೋಹನಕ್ಕೊಳಗಾದ ವ್ಯಕ್ತಿ(person under hypnosis) ತಕ್ಷಣ ಪಾಲಿಸಿತು. ಆಗ ಕೋಪಗೊಂಡ</w:t>
       </w:r>
     </w:p>
     <w:p>
@@ -853,7 +853,7 @@
           <w:i/>
           <w:sz w:val="20"/>
         </w:rPr>
-        <w:t>ಆಧಾರ: ಬನ್ನಂಜೆ ಗೋವಿಂದಾಚಾರ್ಯ ಉಪನಿಷತ್ ಪ್ರವಚನ    Page 8</w:t>
+        <w:t>ಆಧಾರ: ಬನ್ನಂಜೆ ಗೋವಿಂದಾಚಾರ್ಯರ ಉಪನಿಷತ್ ಪ್ರವಚನ Page 8</w:t>
       </w:r>
     </w:p>
     <w:p>
@@ -880,47 +880,31 @@
         <w:spacing w:line="276" w:lineRule="auto" w:after="120"/>
       </w:pPr>
       <w:r>
-        <w:t>ಆ(hypnotiser) "Go to Hell" ಎಂದು ಬಯ್ಯುತ್ತಾನೆ. ತತ್ಕ್ಷಣ ಸಮ್ಮೋಹನಕ್ಕೊಳಗಾದ ವ್ಯಕ್ತಿ ಅಲ್ಲೇ ಬಿದ್ದ ಹಾಗ ತೆಗೆದುಕೊಳ್ಳುತ್ತಾನೆ.</w:t>
-      </w:r>
-    </w:p>
-    <w:p>
-      <w:pPr>
-        <w:spacing w:line="276" w:lineRule="auto" w:after="120"/>
-      </w:pPr>
-      <w:r>
-        <w:t>ಮುಂದಿನ ಕಥೆಗೆ ಹೋಗುವ ಮುನ್ನ ಇಲ್ಲಿ ನಚಿಕೇತನ ಕಥೆಯ ಬಗ್ಗೆ ಸಹ ಲೇಶ ವಿಶೇಷವಾಗಿ ನೋಡೋಣ.</w:t>
-      </w:r>
-    </w:p>
-    <w:p>
-      <w:pPr>
-        <w:spacing w:line="276" w:lineRule="auto" w:after="120"/>
-      </w:pPr>
-      <w:r>
-        <w:t>ನಚಿಕೇತನ ಕಥೆ ಕೇವಲ ಕಠೋಪನಿಷತ್ತಿನಲ್ಲಿ ಮಾತ್ರವಲ್ಲದೆ ತೈತ್ತಿರೀಯ ಬ್ರಾಹ್ಮಣ[೩-೧-೮], ಮಹಾಭಾರತ(ಅನುಶಾಸನ ಪರ್ವ) ಹಾಗೂ ಪುರಾಣದಲ್ಲಿ ಕೂಡ ಪ್ರಸ್ತಾಪವಾಗಿದೆ. ಒಂದೊಂದು ರಾಕೆ ಹಾಕಿದಾಗ ನಮಗೆ ಅಲ್ಲದೆ ಹೊಸ ವಿಷಯಗಳು, ಇನ್ನೂ ಕೆಲವ ವಿವರಣೆಗಳು ಕಂಡು ಬರುತ್ತದೆ. ನಾವು ಎಲ್ಲವನ್ನೂ ಸಮಗ್ರವಾಗಿ ನೋಡಿದಾಗ ಮಾತ್ರ ನಮಗೆ ಕಥೆ ವಿಸ್ತಾರವಾಗಿ ಮತ್ತು ಪೂರ್ಣವಾಗಿ ತಿಳಿಯುತ್ತದೆ. ಆ ಪೂರ್ವೀನರು ಯಾವ ವಿಷಯವನ್ನೂ ಒಂದೇ ಕಡೆ ಬರೆದಿರಲಿಲ್ಲ. ಅವರು ತುಂಬಾ ಮುಖ್ಯವಾದ ವಿಷಯವನ್ನು ಕೇವಲ ಉಪಯೋಗಿಸಬೇಕಾದವರಿಗೆ ಮಾತ್ರ ತಿಳಿಸಬೇಕು ಎನ್ನುವ ಉದ್ದೇಶದಿಂದ ಒಂದು ವಿಷಯವನ್ನು ಅನೇಕ ಗ್ರಂಥಗಳಲ್ಲಿ ಹೊದ್ದಿಸಿ ಇಟ್ಟಿದ್ದರು. ಆದ್ದರಿಂದ ನಾವು ಕೇವಲ ಒಂದು ಅಧಿಕೃತ ಗ್ರಂಥವನ್ನು ನೋಡಿದರೆ ನಮಗೆ ಆ ಕೃತಿಯ ಆಳ ಪೂರ್ಣವಾಗಿ ತಿಳಿಯುವದಿಲ್ಲ. ಹೆಚ್ಚು ಹೆಚ್ಚು ಅಧ್ಯಯನ ಮಾಡಿದಾಗ, ಭಗವದನುಗ್ರಹ ಇದ್ದಾಗ ಮಾತ್ರ ಸತ್ಯದ ಸ್ಮರಣೆ ಆಗುತ್ತದೆ.</w:t>
-      </w:r>
-    </w:p>
-    <w:p>
-      <w:pPr>
-        <w:spacing w:line="276" w:lineRule="auto" w:after="120"/>
-      </w:pPr>
-      <w:r>
-        <w:t>ಈ ಕಥೆ ಮುಂದುವರೆದು – ನಚಿಕೇತ ದೇಹ ತ್ಯಾಗದಿಂದ ಹೋಗಿ ಯಮಲೋಕಕ್ಕೆ ಹೋಗಿ ಅಲ್ಲಿ ಮೂರು ದಿನ ಆಹಾರವಿಲ್ಲದೆ ಕಾದಿದ್ದಾಗ, ಅದನ್ನು ಕಂಡ ಯಮ ನಚಿಕೇತನಿಗೆ "ಮೂರು ವರವನ್ನು ಕೇಳು" ಎಂದು ಹೇಳಿದ ಎಂದು ಹೇಳುತ್ತದೆ. ಆದರೆ ತೈತ್ತಿರೀಯ ಬ್ರಾಹ್ಮಣದಲ್ಲಿ ಇದೇ ಕಥೆ ಸಹಲವು ಭಿನ್ನವಾಗಿದೆ. ದೇಹ ತ್ಯಾಗದಿಂದ ಹೋಗಿ ಮೃತ್ಯುಲೋಕಕ್ಕೆ ತೆರಳಿದ ನಚಿಕೇತನಿಗೆ ಅಲ್ಲಿ ಯಮನ ಪತ್ನಿಯರ ದರ್ಶನವಾಗುತ್ತದೆ. ಆಗ ಅಲ್ಲಿನ ಯಮನ ಪತ್ನಿಯರು "ನಿನಗೆ ಮೂರು ದಿನ ಯಮನ ದರ್ಶನವಾಗುವುದಿಲ್ಲ, ನೀನು ಕಾದಿದ್ದಾಗ ಬರುವ ಯಮನಿಗೆ ಮೂರು ವರವನ್ನು ಕೇಳು" ಎಂದು ಹೇಳುತ್ತಾರೆ. ಆಗ – ತಿರಿಗಿ ಬಂದ ದೇಹದಲ್ಲಿ ಮರಳಿ ಹುಟ್ಟುವಂತೆ, ಅಲ್ಲಿ ಪರಮಾತ್ಮನ ಸಾಕ್ಷಾ ಸಾಧನೆ ಮಾಗಿಲಾಗುವ ಅನುಭವ ಮತ್ತು ದೀಪದ ಇರುಳಿನ ಅನುಭವ ಕೊಡುವಂತೆ ಇಸುವಂತೆ ವರ ಕೇಳು" ಎಂದು ತರಬೇತಿ ಕೊಟ್ಟು ಕಳುಹಿಸುತ್ತಾರೆ ಎಂದು ಹೇಳುತ್ತದೆ. ಇದೇ ಕಥೆ ಮಹಾಭಾರತದಲ್ಲಿ ಇನ್ನೂ ಸಹಲವು ಭಿನ್ನವಾಗಿದೆ.</w:t>
-      </w:r>
-    </w:p>
-    <w:p>
-      <w:pPr>
-        <w:spacing w:line="276" w:lineRule="auto" w:after="120"/>
-      </w:pPr>
-      <w:r>
-        <w:t>ಒಂದು ದಿನ ಉದ್ದಾಲಕ ಮಗನೊಂದಿಗೆ ನದಿಗೆ ನೀರಿಗೆ ಹೋದನು. ಅಲ್ಲಿಂದ ಮರಳುವಾಗ ಆತ ತನ್ನ ನೀರಿನ ಕಲಶವನ್ನು ಮರೆತು ಬಂದ. ಮನೆಗೆ ಬಂದ ಕೂಡಲೇ ಇದನ್ನು ಗಮನಿಸಿದ ಆತ ತನ್ನ ಮಗನಾದ ನಚಿಕೇತನನ್ನು ಕರೆದು, ನೀರಿಗೆ ಹೋಗಿ ಮರೆತು ಬಂದ ನೀರಿನ ಕಲಶವನ್ನು ತರುವಂತೆ ಹೇಳುತ್ತಾನೆ. ಆದರೆ ನಚಿಕೇತ ಕಲಶವನ್ನು ತರದೆ ಬರಿಗೈಯಿಂದ ತಿರುಗುತ್ತಾನೆ. ಈ ಕಾರಣದಿಂದ "ಮಗನಿಗೆ ಸಹಲವು ವಿಷಯಗಳಲ್ಲಿ ಜವಾಬ್ದಾರಿಯಿಲ್ಲ" ಎನ್ನುವ ಅಸಮಾಧಾನ ಉದ್ದಾಲಕನಿಗೆ ಮೂಡುತ್ತದೆ. ಇದಲ್ಲದೆ 'ಆ ಸಮಯದಲ್ಲಿ ಆತ ಹಸಿವಿನಿಂದ ಇದ್ದನ್ನು' ಎನ್ನುತ್ತದೆ ಪುರಾಣ. ಇಂತಹ ಸಂದರ್ಭದಲ್ಲಿ ನಚಿಕೇತ ಪದೇಪದೇ "ನನ್ನನ್ನು ಯಾರಿಗೆ ದಾನ ಕೊಡುತ್ತೀರಿ" ಎಂದು ಕೇಳಿದ್ದರಿಂದ ಉದ್ದಾಲಕ ಕೋಪದಿಂದ "ಮೃತ್ಯುವಿಗೆ ದಾನ ಮಾಡುತ್ತೇನೆ" ಎನ್ನುತ್ತಾನೆ.</w:t>
-      </w:r>
-    </w:p>
-    <w:p>
-      <w:pPr>
-        <w:spacing w:line="276" w:lineRule="auto" w:after="120"/>
-      </w:pPr>
-      <w:r>
-        <w:t>ಮಹಾಭಾರತದಲ್ಲಿ ಹೇಳುವಂತೆ: - ಯಮಲೋಕಕ್ಕೆ ಬಂದ ನಚಿಕೇತನನ್ನು ಯಮ ಸತ್ಕಾರ-ಯೋಗ-ಕ್ಷೇಮದಿಂದ ಮಾಡಿದ. 'ನಿನಗೇನು ಬೇಕು' ಎಂದು ಕೇಳಿದಾಗ "ಸೂಕ್ಷ್ಮಲೋಕವನ್ನು ಕೊಂಡು ಹೋಗಬೇಕು" ಎನ್ನುವ ತನ್ನ ಅಭಿಪ್ರಾಯವನ್ನು ನಚಿಕೇತ ಯಮನ ಮುಂದೆ ಇಟ್ಟ. ಆತನ ಬಯಕೆಯನ್ನು ಪರಿಹರಿಸಿದ ಯಮ ಆತನನ್ನು ರಥದಲ್ಲಿ ಕೂರಿಸಿ, ಸೂಕ್ಷ್ಮಲೋಕಕ್ಕೆ ಕಳುಹಿಸಿಕೊಟ್ಟ. ಎಲ್ಲವನ್ನೂ ನೋಡಿ ಬಂದ ಬಳಿಕ ಯಮ</w:t>
+        <w:t>ಆ(hypnotiser) “Go to Hell” ಎಂದು ಬಯ್ಯುತ್ತಾನೆ. ತಕ್ಷಣ ಸಮ್ಮೋಹನಕ್ಕೊಳಗಾದ ವ್ಯಕ್ತಿ ಅಲ್ಲೇ ಬಿದ್ದು ಪ್ರಾಣ ಕಳೆದುಕೊಳ್ಳುತ್ತಾನೆ].</w:t>
+      </w:r>
+    </w:p>
+    <w:p>
+      <w:pPr>
+        <w:spacing w:line="276" w:lineRule="auto" w:after="120"/>
+      </w:pPr>
+      <w:r>
+        <w:t>ಮುಂದಿನ ಶ್ಲೋಕಕ್ಕೆ ಹೋಗುವ ಮುನ್ನ ಇಲ್ಲಿ ನಚಿಕೇತನ ಕಥೆಯ ಬಗ್ಗೆ ಸ್ವಲ್ಪ ವಿಶ್ಲೇಷಣೆ ಮಾಡೋಣ. ನಚಿಕೇತನ ಕಥೆ ಕೇವಲ ಕಠೋಪನಿಷತ್ತಿನಲ್ಲಿ ಮಾತ್ರವಲ್ಲದೆ ತೈತ್ತಿರೀಯ ಬ್ರಾಹ್ಮಣ[೩-೧-೮], ಮಹಾಭಾರತ[ಅನುಶಾಸನ ಪರ್ವ] ಹಾಗೂ ಪುರಾಣದಲ್ಲಿ ಕೂಡ ಪ್ರಸ್ತಾಪವಾಗಿದೆ. ಒಂದೊಂದನ್ನು ತಾಳೆ ಹಾಕಿದಾಗ ನಮಗೆ ಅಲ್ಲಿ ಕೆಲವೊಂದು ಹೊಸ ವಿಷಯಗಳು, ಇನ್ನು ಕೆಲವು ವ್ಯತ್ಯಾಸಗಳು ಕಂಡು ಬರುತ್ತವೆ. ನಾವು ಎಲ್ಲವನ್ನೂ ಸಮಷ್ಟಿಯಾಗಿ ನೋಡಿದಾಗ ಮಾತ್ರ ನಮಗೆ ಕಥೆ ವಿಸ್ತಾರವಾಗಿ ಮತ್ತು ಪೂರ್ಣವಾಗಿ ತಿಳಿಯುತ್ತದೆ. ಪ್ರಾಚೀನರು ಯಾವ ವಿಷಯವನ್ನೂ ಒಂದೇ ಕಡೆ ಬಿಡಿಸಿ ಹೇಳುತ್ತಿರಲಿಲ್ಲ. ಅವರು ತುಂಬಾ ಗೋಪ್ಯವಾದ ವಿಚಾರ ಕೇವಲ ಯೋಗ್ಯರಾದವರಿಗೆ ಮಾತ್ರ ಸಿಗಬೇಕು ಎನ್ನುವ ಉದ್ದೇಶದಿಂದ ಒಂದು ವಿಷಯವನ್ನು ಅನೇಕ ಗ್ರಂಥಗಳಲ್ಲಿ ಹುದುಗಿಡುತ್ತಿದ್ದರು. ಹಾಗಾಗಿ ನಾವು ಕೇವಲ ಒಂದು ಅಧ್ಯಾತ್ಮ ಗ್ರಂಥವನ್ನು ನೋಡಿದರೆ ನಮಗೆ ಆ ಕೃತಿಯ ಆಳ ಪೂರ್ಣವಾಗಿ ತಿಳಿಯುವುದಿಲ್ಲ. ಹೆಚ್ಚುಹೆಚ್ಚು ಅಧ್ಯಯನ ಮಾಡಿದಾಗ, ಭಗವದನುಗ್ರಹ ಇದ್ದಾಗ ಮಾತ್ರ ಸತ್ಯದ ಸ್ಮರಣೆಯಾಗುತ್ತದೆ.</w:t>
+      </w:r>
+    </w:p>
+    <w:p>
+      <w:pPr>
+        <w:spacing w:line="276" w:lineRule="auto" w:after="120"/>
+      </w:pPr>
+      <w:r>
+        <w:t>ಇಲ್ಲಿ ಕಥೆ ಮುಂದುವರಿದು –ನಚಿಕೇತ ದೇಹತ್ಯಾಗ ಮಾಡಿ ಯಮಲೋಕಕ್ಕೆ ಹೋಗಿ ಅಲ್ಲಿ ಮೂರು ದಿನ ಆಹಾರ ಸೇವಿಸದೆ ಯಮನಿಗಾಗಿ ಕಾದ, ಅತಿಥಿಯನ್ನು ಕಾಯಿಸಿದ್ದಕ್ಕಾಗಿ ಯಮ ನಚಿಕೇತನಲ್ಲಿ “ಮೂರು ವರವನ್ನು ಕೇಳು” ಎಂದು ಹೇಳಿದ ಎಂದಿದೆ. ಆದರೆ ತೈತ್ತಿರೀಯ ಬ್ರಾಹ್ಮಣದಲ್ಲಿ ಇದೇ ಕಥೆ ಸ್ವಲ್ಪ ಭಿನ್ನವಾಗಿದೆ. ದೇಹತ್ಯಾಗ ಮಾಡಿ ಮೃತ್ಯುಲೋಕಕ್ಕೆ ಹೊರಟ ನಚಿಕೇತನಿಗೆ ದಾರಿಯಲ್ಲಿ ವಾಗ್ಗೇವತೆಯ ದರ್ಶನವಾಗುತ್ತದೆ. ಆಕೆ “ನಿನಗೆ ಮೂರು ದಿನ ಯಮನ ದರ್ಶನವಾಗುವುದಿಲ್ಲ, ನಿನ್ನನ್ನು ಕಾಯಿಸಿದ್ದಕ್ಕಾಗಿ ಯಮ ನಿನಗೆ ಮೂರು ವರವನ್ನು ಕೇಳು ಎಂದು ಹೇಳುತ್ತಾನೆ, ಆಗ- ಬಿಟ್ಟು ಬಂದ ದೇಹದಲ್ಲಿ ಮರಳಿ ಹುಟ್ಟುವಂತೆ, ಅಗ್ನಿವಿದ್ಯೆ ಪರಮಾತ್ಮನ ವಿದ್ಯೆಯಾಗಿ ಮೋಕ್ಷ ಸಾಧನವಾಗುವ ಅರಿವು ಕೊಡುವಂತೆ ಮತ್ತು ಮೋಕ್ಷದ ಇರವಿನ ಅರಿವು ತಿಳಿಸುವಂತೆ ವರ ಕೇಳು” ಎಂದು ತರಬೇತಿ ಕೊಟ್ಟು ಕಳುಹಿಸುತ್ತಾಳೆ ಎಂದಿದೆ. ಇದೇ ಕಥೆ ಮಹಾಭಾರತದಲ್ಲಿ ಇನ್ನೂ ಸ್ವಲ್ಪ ಭಿನ್ನವಾಗಿದೆ. ಒಂದು ದಿನ ಉದ್ದಾಲಕ ಮಗನೊಂದಿಗೆ ಸ್ನಾನಕ್ಕಾಗಿ ನದಿ ತೀರಕ್ಕೆ ಹೋದ. ಅಲ್ಲಿಂದ ಮರಳುವಾಗ ಆತ ತನ್ನ ಸ್ನಾನದ ಕಲಶವನ್ನು ಮರೆತು ಬಂದ. ಮನೆಗೆ ಬಂದ ಮೇಲೆ ಇದನ್ನು ಗಮನಿಸಿದ ಆತ ತನ್ನ ಮಗ ನಚಿಕೇತನನ್ನು ಕರೆದು, ನದಿ ತೀರಕ್ಕೆ ಹೋಗಿ ಮರೆತು ಬಂದ ಸ್ನಾನದ ಕಲಶವನ್ನು ತರುವಂತೆ ಹೇಳುತ್ತಾನೆ. ಆದರೆ ನಚಿಕೇತ ಕಲಶವನ್ನು ತರದೆ ಬರಿಗೈಯಲ್ಲಿ ಹಿಂದಿರುಗುತ್ತಾನೆ. ಈ ಕಾರಣದಿಂದಾಗಿ “ಮಗನಲ್ಲಿ ಸ್ವಲ್ಪವೂ ಜವಾಬ್ದಾರಿ ಇಲ್ಲ” ಎನ್ನುವ ಅಸಮಾಧಾನ ಉದ್ದಾಲಕನಲ್ಲಿ ಮೂಡುತ್ತದೆ. ಇದಲ್ಲದೆ ‘ಆ ಸಮಯದಲ್ಲಿ ಆತ ಹಸಿದಿದ್ದ’ ಎನ್ನುತ್ತದೆ ಪುರಾಣ. ಇಂತಹ ಸಂದರ್ಭದಲ್ಲಿ ನಚಿಕೇತ ಪದೇಪದೇ “ನನ್ನನ್ನು ಯಾರಿಗೆ ದಾನ ಕೊಡುತ್ತೀರಿ” ಎಂದು ಕೇಳಿದ್ದರಿಂದ ಉದ್ದಾಲಕ ಕೋಪದಿಂದ “ಮೃತ್ಯುವಿಗೆ ದಾನ ಮಾಡಿದ್ದೇನೆ” ಎನ್ನುತ್ತಾನೆ.</w:t>
+      </w:r>
+    </w:p>
+    <w:p>
+      <w:pPr>
+        <w:spacing w:line="276" w:lineRule="auto" w:after="120"/>
+      </w:pPr>
+      <w:r>
+        <w:t>ಮಹಾಭಾರತದಲ್ಲಿ ಹೇಳುವಂತೆ: - ಯಮಲೋಕಕ್ಕೆ ಬಂದ ಪುಣ್ಯಜೀವಿ ನಚಿಕೇತನನ್ನು ಯಮ ಸತ್ಕರಿಸಿ ಯೋಗ-ಕ್ಷೇಮ ವಿಚಾರಿಸಿದ. ‘ನಿನಗೇನು ಬೇಕು’ ಎಂದು ಕೇಳಿದ್ದಕ್ಕೆ “ಸೂಕ್ಷ್ಮಲೋಕವನ್ನೊಮ್ಮೆ ನೋಡಬೇಕು” ಎನ್ನುವ ತನ್ನ ಅಭಿಲಾಷೆಯನ್ನು ನಚಿಕೇತ ಯಮನ ಮುಂದಿಟ್ಟ. ಆತನ ಬಯಕೆಯನ್ನು ಪುರಸ್ಕರಿಸಿದ ಯಮ ಆತನನ್ನು ರಥದಲ್ಲಿ ಕುಳ್ಳಿರಿಸಿ, ಸೂಕ್ಷ್ಮಲೋಕ ವೀಕ್ಷಣೆಗೆ ಕಳುಹಿಸಿಕೊಟ್ಟ. ಎಲ್ಲವನ್ನೂ ನೋಡಿ ಬಂದ ಮೇಲೆ ಯಮ</w:t>
       </w:r>
     </w:p>
     <w:p>
@@ -933,7 +917,7 @@
           <w:i/>
           <w:sz w:val="20"/>
         </w:rPr>
-        <w:t>ಆಧಾರ: ಬನ್ನಂಜೆ ಗೋವಿಂದಾಚಾರ್ಯ ಉಪನಿಷತ್ ಪ್ರವಚನ    Page 9</w:t>
+        <w:t>ಆಧಾರ: ಬನ್ನಂಜೆ ಗೋವಿಂದಾಚಾರ್ಯರ ಉಪನಿಷತ್ ಪ್ರವಚನ Page 9</w:t>
       </w:r>
     </w:p>
     <w:p>
@@ -960,23 +944,23 @@
         <w:spacing w:line="276" w:lineRule="auto" w:after="120"/>
       </w:pPr>
       <w:r>
-        <w:t>ನಚಿಕೇತನಿಗೆ "ನಿನ ಆಯಸ್ಸು ಇನ್ನೂ ಮುಗಿದಿಲ್ಲ, ತಂದೆಯ ಆಶೀರ್ವಾದ ಸ್ವೀಕರಿಸುವ ದಿಂದ ಉಪಕಾರ ಬಂದಿರುವಂತಹ ನೀನು, ಮರಳಿ ಹೋಗು" ಎಂದು ಹೇಳಿ ಕಳುಹಿಸಿಕೊಟ್ಟನಂತೆ. ಹಾಗೆ ಕಳುಹಿಸುತ್ತಾಗ ಯಮ "ಯಜಮಾನನ ಬಹಳ ವಿಶೇಷವಾದದ್ದು, ಅದನ್ನು ಲೋಭದಿಂದ ಮಾಡಿ ವ್ಯರ್ಥ ಮಾಡಬೇಡ" ಎನ್ನುವ ಸಂದೇಶವನ್ನು ಉದ್ದಾಲಕನಿಗೆ ಕಳುಹಿಸಿಕೊಟ್ಟನಂತೆ. –ಇದು ಕಥೆ.</w:t>
-      </w:r>
-    </w:p>
-    <w:p>
-      <w:pPr>
-        <w:spacing w:line="276" w:lineRule="auto" w:after="120"/>
-      </w:pPr>
-      <w:r>
-        <w:t>ಕಥೆಯಲ್ಲಿ ಹೇಳಿದ 'ಮೂರು ದಿನಗಳು' ಕೇವಲ ನಚಿಕೇತನ ಅಂತರದೃಷ್ಟಿಯಲ್ಲಿ ಮೂಡಿ ಬಂದ ಮೂರು ದಿನಗಳೇ ಹೊರತು, ಇದು ದೇವಲೋಕದ ಅಥವಾ ಭೂಲೋಕದ ಮೂರು ದಿನಗಳಲ್ಲ. ಏಕೆಂದರೆ ದೇವಲೋಕದ ಮೂರು ದಿನ ಎಂದರೆ ನಮಗೆ ಮೂರು ವರ್ಷಗಳು. ಸತ್ತ ಮಗನ ಶರೀರವನ್ನು ಮುಂದೆ ಇಟ್ಟುಕೊಂಡು ಉದ್ದಾಲಕ ತಿರುಗಿತಿರುಗಿ ಪರಿತಾಪಪಟ್ಟ, ಮುಂದೆಯಿಂದ ಸತ್ತ ಮಗ ಜೀವಂತ ಮಾಗಿ ಎದ್ದು ನಿಂತ ಎಂದು ಒಂದು ಕಡೆ ಹೇಳಿರುವದರಿಂದ, ನಚಿಕೇತನ ಸೂಕ್ಷ್ಮಲೋಕದ ಪಯಣ ಕೇವಲ ಕೆಲವ ಘಂಟೆಯಷ್ಟೆ ಎನ್ನುವದು ಇಲ್ಲಿ ಸ್ಪಷ್ಟ. ನಮಗೆ ಒಳಗಿನ ನೋಟದ ಸಮಯದ ಅರಿವೇ ಇಲ್ಲ. ಒಂದು ಕ್ಷಣದಲ್ಲಿ ಹಲವಾರು ದಿನಗಳ ಕಥೆಯನ್ನು ಅಂತರದೃಷ್ಟಿಯಲ್ಲಿ ಕಾಣಬಹುದು. ಇಲ್ಲಿ ನಚಿಕೇತ ಮಾಡಿರುವದು ಅಂತರ್ದರ್ಶನ. ಬನ್ನಿ, ಈ ಎಲ್ಲಾ ಅಂಶಗಳನ್ನು ಗಮನದಲ್ಲಿ ಇಟ್ಟುಕೊಂಡು ಮುಂದಿನ ಶ್ಲೋಕಗಳನ್ನು ನೋಡೋಣ.</w:t>
-      </w:r>
-    </w:p>
-    <w:p>
-      <w:pPr>
-        <w:spacing w:line="276" w:lineRule="auto" w:after="120"/>
-      </w:pPr>
-      <w:r>
-        <w:t>ಬಹೂನಾಮೇಮಿ ಪ್ರಥಮೋ  ಬಹೂನಾಮೇಮಿ ಮಧ್ಯಮಃ |</w:t>
+        <w:t>ನಚಿಕೇತನಲ್ಲಿ “ನಿನ್ನ ಆಯಸ್ಸು ಇನ್ನೂ ಮುಗಿದಿಲ್ಲ, ತಂದೆಯ ಆಜ್ಞೆ ಪಾಲಿಸುವುದಕ್ಕೋಸ್ಕರ ಬಂದಿರುವ ನೀನು, ಮರಳಿ ಹೋಗು” ಎಂದು ಹೇಳಿ ಕಳುಹಿಸಿ ಕೊಟ್ಟನಂತೆ. ಹೀಗೆ ಕಳುಹಿಸುವಾಗ ಯಮ “ಗೋದಾನ ಬಹಳ ವಿಶೇಷವಾದದ್ದು, ಅದನ್ನು ಲೋಭದಿಂದ ಮಾಡಿ ವ್ಯರ್ಥ ಮಾಡಬೇಡ” ಎನ್ನುವ ಸಂದೇಶವನ್ನು ಉದ್ದಾಲಕನಿಗೆ ಕಳುಹಿಸಿಕೊಟ್ಟ ಎಂದಿದೆ. –ಇದು ಕಥೆ.</w:t>
+      </w:r>
+    </w:p>
+    <w:p>
+      <w:pPr>
+        <w:spacing w:line="276" w:lineRule="auto" w:after="120"/>
+      </w:pPr>
+      <w:r>
+        <w:t>ಕಥೆಯಲ್ಲಿ ಹೇಳಲಾದ ‘ಮೂರು ದಿನಗಳು’ ಕೇವಲ ನಚಿಕೇತನ ಅಂತರ್ದೃಷ್ಟಿಯಲ್ಲಿ ಮೂಡಿ ಬಂದ ಮೂರು ದಿನಗಳೇ ಹೊರತು, ಇದು ದೇವಲೋಕದ ಅಥವಾ ಭೂಲೋಕದ ಮೂರು ದಿನಗಳಲ್ಲ. ಏಕೆಂದರೆ ದೇವಲೋಕದ ಮೂರು ದಿನ ಎಂದರೆ ನಮ್ಮ ಮೂರು ವರ್ಷ. ಸತ್ತ ಮಗನ ಶರೀರವನ್ನು ಮುಂದಿಟ್ಟುಕೊಂಡು ಉದ್ದಾಲಕ ರಾತ್ರಿಯೆಲ್ಲಾ ಪಶ್ಚಾತ್ತಾಪಪಟ್ಟು, ಮುಂಜಾನೆ ಸತ್ತ ಮಗ ಜೀವಂತವಾಗಿ ಎದ್ದು ನಿಂತ ಎಂದು ಒಂದು ಕಡೆ ಹೇಳಿರುವುದರಿಂದ, ನಚಿಕೇತನ ಸೂಕ್ಷ್ಮಲೋಕದ ಪಯಣ ಕೇವಲ ಕೆಲವು ಘಳಿಗೆಯದ್ದಾಗಿತ್ತು ಎನ್ನುವುದು ಇಲ್ಲಿ ಸ್ಪಷ್ಟ. ನಮ್ಮ ಒಳಗಿನ ನೋಟಕ್ಕೆ ಸಮಯದ ಆಪೇಕ್ಷೆ ಇಲ್ಲ. ಒಂದು ಕ್ಷಣದಲ್ಲಿ ಹತ್ತಾರು ದಿನದ ಕಥೆಯನ್ನು ಅಂತರ್ದೃಷ್ಟಿಯಲ್ಲಿ ಕಾಣಬಹುದು. ಇಲ್ಲಿ ನಚಿಕೇತನಿಗಾಗಿರುವುದು ಅಂತಃದರ್ಶನ. ಬನ್ನಿ, ಈ ಎಲ್ಲಾ ಹಿನ್ನೆಲೆಯನ್ನು ಗಮನದಲ್ಲಿಟ್ಟುಕೊಂಡು ಮುಂದಿನ ಶ್ಲೋಕಗಳನ್ನು ನೋಡೋಣ.</w:t>
+      </w:r>
+    </w:p>
+    <w:p>
+      <w:pPr>
+        <w:spacing w:line="276" w:lineRule="auto" w:after="120"/>
+      </w:pPr>
+      <w:r>
+        <w:t>ಬಹೂನಾಮೇಮಿ ಪ್ರಥಮೋ ಬಹೂನಾಮೇಮಿ ಮಧ್ಯಮಃ |</w:t>
       </w:r>
     </w:p>
     <w:p>
@@ -992,7 +976,7 @@
         <w:spacing w:line="276" w:lineRule="auto" w:after="120"/>
       </w:pPr>
       <w:r>
-        <w:t>"ನಿನ್ನನ್ನು ಮೃತ್ಯುವಿಗೆ ದಾನ ಮಾಡುತ್ತೇನೆ - ಅಲ್ಲಿಗೆ ಹೋಗು" ಎನ್ನುವ ತಂದೆಯ ಕೋಪದ ಮಾತನ್ನು ನಚಿಕೇತ ಆದೇಶವಾಗಿ ಸ್ವೀಕರಿಸಿ, ಸ್ಥೂಲ ದೇಹವನ್ನು ಬಿಟ್ಟು ಪರಲೋಕದತ್ತ ತನ್ನ ಸೂಕ್ಷ್ಮ ಶರೀರದ ಮೂಲಕ ಪಯಣಿಸುತ್ತಾನೆ. ಹೀಗೆ ಸಾಗುತ್ತಾಗ ಆತನಿಗೆ ಮುಂದೆ ಆತನ ನಂತರ ಸತ್ತಿರುವವರು ಹಾಗೂ ಆತನಿಗಿಂತ ಮುಂದೆ ಆತನಿಗಿಂತ ಮೊದಲು ಸತ್ತ ಜೀವಗಳ ಪ್ರವಾಹ ಕಾಣಿಸಿಕೊಳ್ಳುತ್ತದೆ. ಆತನ ಹಿಂದಿರುವ ಜೀವಗಳ ಮುಂದಾಳಾಗಿ, ಆತನಿಗಿಂತ ಮುಂದಿರುವ ಜೀವಗಳ ಗುಂಪಿನ ಒಬ್ಬನಾಗಿ ನಚಿಕೇತ ಪರಲೋಕದತ್ತ ತೆರಳುತ್ತಾನೆ. ಹೀಗೆ ಸಾಗುತ್ತ ಆತ ತನ್ನ ತಂದೆಯ ಮೇಲೆ ಯಾವದೇ ಕೋಪ ಇರಲಿಲ್ಲ. ತಾನು ಕಿರಿಯ ವಯಸ್ಸಿನಲ್ಲೇ ಸಾಯಬೇಕಾ ಬಂತಲ್ಲಾ ಎನ್ನುವ ದುಃಖವ ಇರಲಿಲ್ಲ. ಆದರೆ ತಂದೆ ನನ್ನನ್ನು ಯಮನಿಗೆ ದಾನ ಮಾಡಿ ಕೊಟ್ಟು, ಈ ದಾನವನ್ನೂ ವ್ಯರ್ಥ ಮಾಡಿದನಲ್ಲಾ ಎನ್ನುವ ಕೇಸರ ಬಂತು. ಏಕೆಂದರೆ ಒಂದು ವೇಳೆ ಇಲ್ಲಿ ಯಾರಿಗಾದರೂ ದಾನ ಮಾಡಿದ ನಚಿಕೇತ ಅವರ ಕೈಯಲ್ಲಿ ಒಪ್ಪಿಕೊಂಡು ಬದುಕುತ್ತಿದ್ದ ಮತ್ತು ಅದರ ಪ್ರಣ ತಂದೆಗೆ ಸೇರುತ್ತಿತ್ತು. ಆದರೆ ಇಲ್ಲಿ ಯಮ ದಾನ ಮಾಡಿರುವದರಿಂದ - ಯಮನ ಕಡೆಯಿಂದ ಯಾವ ಉಪಯೋಗವ ಇಲ್ಲ, ಆದ್ದರಿಂದ ಈ ದಾನವ ವ್ಯರ್ಥ ಮಾಡಿದ್ದಾ ಎನ್ನುವದು ಆತನ ಚಿಂತೆ.</w:t>
+        <w:t>“ನಿನ್ನನ್ನು ಮೃತ್ಯುವಿಗೆ ದಾನ ಮಾಡಿದ್ದೇನೆ-ಅಲ್ಲಿಗೆ ಹೋಗು” ಎನ್ನುವ ತಂದೆಯ ಕೋಪದ ಮಾತನ್ನು ನಚಿಕೇತ ಆದೇಶವಾಗಿ ಸ್ವೀಕರಿಸಿ, ಸ್ಥೂಲ ದೇಹವನ್ನು ತೊರೆದು ಪರಲೋಕದತ್ತ ತನ್ನ ಸೂಕ್ಷ್ಮಶರೀರದ ಮೂಲಕ ಪಯಣಿಸುತ್ತಾನೆ. ಹೀಗೆ ಸಾಗುವಾಗ ಆತನ ಹಿಂದೆ ಆತನ ನಂತರ ಸತ್ತವರು ಹಾಗೂ ಆತನಿಗಿಂತ ಮುಂದೆ ಆತನಿಗಿಂತ ಮೊದಲು ಸತ್ತ ಜೀವಗಳ ಪ್ರವಾಹವೇ ಸಾಗುತ್ತಿತ್ತು. ಆತನ ಹಿಂದಿರುವ ಜೀವಗಳ ಮುಂದಾಳಾಗಿ, ಆತನಿಗಿಂತ ಮುಂದಿರುವ ಜೀವಗಳ ಗುಂಪಿನಲ್ಲಿ ಒಬ್ಬನಾಗಿ ನಚಿಕೇತ ಪರಲೋಕದತ್ತ ತೆರಳುತ್ತಿದ್ದ. ಹೀಗೆ ಸಾಗುತ್ತಿದ್ದ ಆತನಿಗೆ ತನ್ನ ತಂದೆಯ ಮೇಲೆ ಯಾವುದೇ ಕೋಪವಿರಲಿಲ್ಲ. ತಾನು ಚಿಕ್ಕ ವಯಸ್ಸಿನಲ್ಲೇ ಸಾಯಬೇಕಾಗಿ ಬಂತಲ್ಲಾ ಎನ್ನುವ ದುಃಖವೂ ಇರಲಿಲ್ಲ. ಆದರೆ ತಂದೆ ನನ್ನನ್ನು ಯಮನಿಗೆ ದಾನವಾಗಿ ಕೊಟ್ಟು, ಈ ದಾನವನ್ನೂ ವ್ಯರ್ಥ ಮಾಡಿದನಲ್ಲಾ ಎನ್ನುವ ಬೇಸರವಿತ್ತು. ಏಕೆಂದರೆ ಒಂದು ವೇಳೆ ಇನ್ಯಾರಿಗೋ ದಾನ ಮಾಡುತ್ತಿದ್ದರೆ ನಚಿಕೇತ ಅವರ ಸೇವೆ ಮಾಡಿಕೊಂಡು ಬದುಕುತ್ತಿದ್ದ ಮತ್ತು ಅದರ ಪುಣ್ಯ ತಂದೆಗೆ ಸೇರುತ್ತಿತ್ತು. ಆದರೆ ಇಲ್ಲಿ ಯಮನಿಗೆ ದಾನ ಮಾಡಿರುವುದರಿಂದ- ಯಮನಿಗೆ ತನ್ನಿಂದ ಯಾವ ಉಪಯೋಗವೂ ಇಲ್ಲ, ಆದ್ದರಿಂದ ಈ ದಾನವೂ ವ್ಯರ್ಥವಾಯಿತಲ್ಲಾ ಎನ್ನುವುದು ಆತನ ಚಿಂತೆ.</w:t>
       </w:r>
     </w:p>
     <w:p>
@@ -1021,7 +1005,7 @@
           <w:i/>
           <w:sz w:val="20"/>
         </w:rPr>
-        <w:t>ಆಧಾರ: ಬನ್ನಂಜೆ ಗೋವಿಂದಾಚಾರ್ಯ ಉಪನಿಷತ್ ಪ್ರವಚನ    Page 10</w:t>
+        <w:t>ಆಧಾರ: ಬನ್ನಂಜೆ ಗೋವಿಂದಾಚಾರ್ಯರ ಉಪನಿಷತ್ ಪ್ರವಚನ Page 10</w:t>
       </w:r>
     </w:p>
     <w:p>
@@ -1048,7 +1032,7 @@
         <w:spacing w:line="276" w:lineRule="auto" w:after="120"/>
       </w:pPr>
       <w:r>
-        <w:t>ಯಮಲೋಕದತ್ತ ಸಾಗುತ್ತಿರುವ ನಚಿಕೇತ ಯಮಧೂತರ ಮಾತುಗಳನ್ನೂ ಕೇಳಿಕೊಳ್ಳುತ್ತಾನೆ. ಅವರು ಹೇಳುತ್ತಾರೆ: "ನಾಗಳು ಯಮಲೋಕದಲ್ಲಿ ಯಾವದೇ ಮಾತ್ರ ಅನುಭವಿಸುತ್ತಾರೆ ಅನ್ನುವ ದನ್ನು ಅನುಭವ ಕೊಡು" ಎಂದು. "ಹಿಂದೆ ಬಂದವರು ಅನುಭವಿಸಿದ್ದು ಇದ ಏ, ಮುಂದೆ ಬರುವವರು ಅನುಭವಿಸುವದ್ದು ಇದ ಏ. ಸಸ್ಯವನ್ನು (ತರಕಾರಿಯನ್ನು) ಕೊಯ್ದು ಕಟ್ಟಿ ಹಾಕುತ್ತಾರೋ, ಹಾಗೇ ನಾಗಳನ್ನು ನರಕದ ಕುಂಡದಲ್ಲಿ ಕಟ್ಟಿ ಹಾಕುತ್ತಾರೆ. ಅವರು ಈ ರೀತಿ ದುಃಖದಲ್ಲಿ ಕೊಂದು, ದುಃಖವನ್ನು ಅನುಭವಿಸಿ, ಪಕ್ವ ಆಗಿ ಪುನಃ ಭೂಮಿಯಲ್ಲಿ ಹುಟ್ಟುತ್ತಾರೆ".</w:t>
+        <w:t>ಯಮಲೋಕದತ್ತ ಸಾಗುತ್ತಿರುವ ನಚಿಕೇತ ಯಮಧೂತರ ಮಾತುಗಳನ್ನೂ ಕೇಳಿಸಿಕೊಳ್ಳುತ್ತಾನೆ. ಅವರು ಹೇಳುತ್ತಾರೆ: ಪಾಪಿಗಳು ಯಮಲೋಕದಲ್ಲಿ ಯಾವ ರೀತಿ ಯಾತನೆ ಅನುಭವಿಸುತ್ತಾರೆ ಅನ್ನುವುದನ್ನು ಅನುಭವಿಸಿ ನೋಡು” ಎಂದು. “ಹಿಂದೆ ಬಂದವರು ಅನುಭವಿಸಿದ್ದು ಇದನ್ನೇ, ಮುಂದೆ ಬರುವವರು ಅನುಭವಿಸುವುದೂ ಇದನ್ನೇ. ಸಸ್ಯವನ್ನು(ತರಕಾರಿಯನ್ನು) ಹೇಗೆ ಪಾತ್ರೆಯಲ್ಲಿ ಹಾಕಿ ಕುದಿಸುತ್ತಾರೋ, ಹಾಗೇ ಪಾಪಿಗಳನ್ನು ನರಕದ ಕುಂಡದಲ್ಲಿ ಕುದಿಸುತ್ತಾರೆ. ಅವರು ಈ ರೀತಿ ದುಃಖದಲ್ಲಿ ಬೆಂದು, ದುಃಖವನ್ನು ಅನುಭವಿಸಿ, ಪಕ್ವವಾಗಿ ಪುನಃ ಭೂಮಿಯಲ್ಲಿ ಹುಟ್ಟುತ್ತಾರೆ”.</w:t>
       </w:r>
     </w:p>
     <w:p>
@@ -1064,23 +1048,23 @@
         <w:spacing w:line="276" w:lineRule="auto" w:after="120"/>
       </w:pPr>
       <w:r>
-        <w:t>ತಸ್ಯೈತꣳ ಶಾಂತಿಂ ಕುರ್ವಂತಿ ಹರ ವೈವಸ್ವತೋದಕಂ ॥೭॥</w:t>
-      </w:r>
-    </w:p>
-    <w:p>
-      <w:pPr>
-        <w:spacing w:line="276" w:lineRule="auto" w:after="120"/>
-      </w:pPr>
-      <w:r>
-        <w:t>ಹಿಂದೆ ಹೇಳಿದಂತೆ ಯಮಲೋಕವನ್ನು ತಲುಪಿದ ನಚಿಕೇತನಿಗೆ ತತ್ಕ್ಷಣ ಯಮನ ದರ್ಶನ ಆಗುವದಿಲ್ಲ. ಜ್ಞಾನಿಯಾದ ನಚಿಕೇತನನ್ನು ಯಮನ ಪತ್ನಿ ಉಪಚರಿಸುತ್ತಾಳೆ. ಆದರೆ ನಚಿಕೇತ ಯಮನ ದರ್ಶನ ಆಗುವ ತನಕ ಯಾವದೇ ಆಹಾರವನ್ನು ಸ್ವೀಕರಿಸುವದಿಲ್ಲ. ಈ ರೀತಿ ಕಾಯುತ್ತಿರುವಾಗ ಯಮನ ಆಗಮನ ಆಗುತ್ತದೆ. ಹೀಗೆ ಬಂದ ಯಮನಿಗೆ ಯಮನ ಪತ್ನಿ ಹೇಳುತ್ತಾಳೆ: "ಹಸಿದು ಬಂದ ಒಬ್ಬ ಬ್ರಾಹ್ಮಣ ನಮ್ಮ ಮನೆ ಮುಂದೆ ಉಪವಾಸ ಕೂತಿದ್ದಾನೆ. ತನ್ನ ಗೋತ್ರ-ಯ ವೈಶ್ವಾನರ(ಅಗ್ನಿ, ನಾರಾಯಣ)ನನ್ನು ಹೊತ್ತು ಬಂದಿರುವ ಅತಿಥಿಯ ಹಸಿವನ್ನು ಮೊದಲು ತಣಿಸು. ಇಲ್ಲದಿದ್ದರೆ ನಮ್ಮ ಇಡೀ ದೇವಲೋಕ ಭಸ್ಮ ಆಗೇತು" ಎಂದು.</w:t>
-      </w:r>
-    </w:p>
-    <w:p>
-      <w:pPr>
-        <w:spacing w:line="276" w:lineRule="auto" w:after="120"/>
-      </w:pPr>
-      <w:r>
-        <w:t>ಇಲ್ಲಿ ಅತಿಥಿ ಎಂದರೆ ಆಕಸ್ಮಿಕವಾಗಿ ಹಸಿದು ಆಹಾರ ಬಯಸಿ ಬರುವವರು. ಇವರಿಗೆ ತಿಥಿ(ದಿನಾಂಕ ಅಥವಾ ಸಮಯ) ಇಲ್ಲ. [ನಾವು ಕರೆದಾಗ ಬರುವವರು, ನೆಂಟರಿಷ್ಟರು, ಅತಿಥಿಗಳಲ್ಲ-ಅವರು ಅಭ್ಯಾಗತರು]. ಹಿಂದೆ ಇಂದಿನಂತೆ ವಸತಿ ಗೃಹ, ಉಪಾಹಾರ ಗೃಹಗಳಿರಲಿಲ್ಲ. ಪ್ರಯಾಣದಿಂದ ಮನೆ ಹಸಿದು ಬರುವವರಿಗೆ ಅನ್ನ-ನೀರು ಕೊಡುವ ಅದ್ಭುತ ಸಂಪ್ರದಾಯ ಈ ದೇಶದ್ದು ಆಗಿತ್ತು. ಶಾಸ್ತ್ರಕಾರರ ಪ್ರಕಾರ ಹಾಗೆ ಹಸಿದವರು ಬಂದರೂ ನಾವು ಅವರನ್ನು ಹೊರ ತಳ್ಳಿ ಕಳಿಸಬಾರದು. ಅವನ ಕುಲ-ಗೋತ್ರ ಯಾವದ್ದೂ ಇಲ್ಲಿ ಪ್ರಮುಖವಲ್ಲ. ಹಸಿದು ಬಂದವ ಅತಿಥಿ ಅಗಿ. "ಹಸಿದು ಬಂದವನ ಹಸಿವನ್ನು ತಣಿಸದ ಎಡೆ ಆತನ ಹೊಟ್ಟೆ ಯ ನೋ ಅ ನ ಮನ್ಯನ್ನು ಸುಡುತ್ತದೆ" ಎನ್ನುವದು ನಮ್ಮ ಪ್ರಾಚೀನರು ಕಂಡುಕೊಂಡ ಸತ್ಯ ಆಗಿತ್ತು. ಅತಿಥಿ ರೂಪದಲ್ಲಿ ಭಗವಂತ ಬಂದಾಗ, ಮೊದಲು ಮೂರು ಬಗೆಯ ನೀರನ್ನು ಕೊಟ್ಟು ಶಾಂತ ಮಾಡಿ ಸ್ವೀಕರಿಸ ಬೇಕು. ಕೈ ತೊಳೆಯುವ ನೀರು-ಅರ್ಘ್ಯ, ಕಾಲು ತೊಳೆಯುವ ನೀರು-ಪಾದ್ಯ ಮತ್ತು ಕುಡಿಯುವ ನೀರು-ಆಚಮನ. ಇಲ್ಲಿ ಒಬ್ಬ ಬ್ರಾಹ್ಮಣ ಅತಿಥಿ ಆಗಿ ಬಂದು ಯಮನ ಬಾಗಿಲಲ್ಲಿ ಪಾದ ಕುಳಿತ್ತಾ. ಅದ ಕಾರಣ ಯಮನ ಹೊಂಡಲ್ಲಿ ಪಾದ ಕುಳಿತಿರುವ ಅತಿಥಿಯ ಸ್ವಾಗತ ಮಾಡಿ ಆತನ ಗೋತ್ರ-ಯ ಅತಿಥಿಯನ್ನು ತಣಿಸು" ಎಂದು ವಿವಸ್ವತ(ಸೂರ್ಯನ) ಮಗ ಆದ ಯಮ ಹೇಳುತ್ತಾನೆ. [ಕೆಲವ ಅನುವಾದಕಾರರು ಈ ಮಾತನ್ನು ಯಮನ ಮಂದಿಗಳು ಹೇಳಿದರು ಎಂದು ಬರೆಯುತ್ತಾರೆ. ಆದರೆ ಹಿಂದೆ ಹೇಳಿದಂತೆ ಮಹಾಭಾರತ, ತೈತ್ತಿರೀಯ ಬ್ರಾಹ್ಮಣ ಮತ್ತು ಪುರಾಣದಲ್ಲಿ ಬರುವ ನಚಿಕೇತನ</w:t>
+        <w:t>ತಸ್ಯೈತಾಂ ಶಾಂತಿಂ ಕುರ್ವಂತಿ ಹರ ವೈವಸ್ವತೋದಕಂ ॥೭॥</w:t>
+      </w:r>
+    </w:p>
+    <w:p>
+      <w:pPr>
+        <w:spacing w:line="276" w:lineRule="auto" w:after="120"/>
+      </w:pPr>
+      <w:r>
+        <w:t>ಹಿಂದೆ ಹೇಳಿದಂತೆ ಯಮಲೋಕವನ್ನು ತಲುಪಿದ ನಚಿಕೇತನಿಗೆ ತಕ್ಷಣ ಯಮನ ದರ್ಶನ ಆಗುವುದಿಲ್ಲ. ಜ್ಞಾನಿಯಾದ ನಚಿಕೇತನನ್ನು ಯಮನ ಪತ್ನಿ ಉಪಚರಿಸುತ್ತಾಳೆ. ಆದರೆ ನಚಿಕೇತ ಯಮನ ದರ್ಶನ ಆಗುವ ತನಕ ಯಾವುದೇ ಆಹಾರವನ್ನು ಸ್ವೀಕರಿಸುವುದಿಲ್ಲ. ಈ ರೀತಿ ಕಾಯುತ್ತಿರುವಾಗ ಯಮನ ಆಗಮನವಾಗುತ್ತದೆ. ಹೀಗೆ ಬಂದ ಯಮನಿಗೆ ಯಮನ ಪತ್ನಿ ಹೇಳುತ್ತಾಳೆ: “ಹಸಿದು ಬಂದ ಒಬ್ಬ ಬ್ರಹ್ಮಜ್ಞಾನಿ ನಮ್ಮ ಮನೆ ಮುಂದೆ ಉಪವಾಸ ಕುಳಿತಿದ್ದಾನೆ. ತನ್ನ ಹೊಟ್ಟೆಯಲ್ಲಿ ವೈಶ್ವಾನರ(ಬೆಂಕಿ, ಅಗ್ನಿ ನಾರಾಯಣ)ನನ್ನು ಹೊತ್ತು ಬಂದಿರುವ ಅತಿಥಿಯ ಹಸಿವನ್ನು ಮೊದಲು ಹಿಂಗಿಸು. ಇಲ್ಲದಿದ್ದರೆ ನಮ್ಮ ಇಡೀ ದೇವಲೋಕ ಭಸ್ಮವಾದೀತು” ಎಂದು.</w:t>
+      </w:r>
+    </w:p>
+    <w:p>
+      <w:pPr>
+        <w:spacing w:line="276" w:lineRule="auto" w:after="120"/>
+      </w:pPr>
+      <w:r>
+        <w:t>ಇಲ್ಲಿ ಅತಿಥಿ ಎಂದರೆ ಆಕಸ್ಮಿಕವಾಗಿ ಹಸಿದು ಆಹಾರ ಬಯಸಿ ಬರುವವರು. ಇವರಿಗೆ ತಿಥಿ(ದಿನಾಂಕ ಅಥವಾ ಸಮಯ) ಇಲ್ಲ. [ನಾವು ಕರೆದಾಗ ಬರುವವರು, ನೆಂಟರಿಷ್ಟರು, ಅತಿಥಿಗಳಲ್ಲ-ಅವರು ಅಭ್ಯಾಗತರು]. ಹಿಂದೆ ಇಂದಿನ ರೀತಿ ವಸತಿಗೃಹ, ಉಪಹಾರ ಗೃಹಗಳಿರಲಿಲ್ಲ. ಪ್ರತಿಯೊಂದು ಮನೆಯಲ್ಲಿ ಹಸಿದು ಬರುವvನಿಗೆ ಅನ್ನ-ನೀರು ಕೊಡುವ ಅದ್ಭುತ ಸಂಪ್ರದಾಯ ಈ ದೇಶದಲ್ಲಿತ್ತು. ಶಾಸ್ತ್ರಕಾರರ ಪ್ರಕಾರ ಯಾರೇ ಹಸಿದವರು ಬಂದರೂ ನಾವು ಅವರ ಹೊಟ್ಟೆ ತಣಿಸದೆ ಕಳುಹಿಸಬಾರದು. ಅವನ ಕುಲ-ಗೋತ್ರ ಯಾವುದೂ ಇಲ್ಲಿ ಪ್ರಮುಖವಲ್ಲ. ಹಸಿದು ಬಂದವ ಅತಿಥಿ ಅಷ್ಟೇ. “ಹಸಿದು ಬಂದವನ ಹಸಿವನ್ನು ತಣಿಸದಿದ್ದರೆ ಆತನ ಹೊಟ್ಟೆಯಲ್ಲಿನ ಬೆಂಕಿ ನಿನ್ನ ಮನೆಯನ್ನು ಸುಡುತ್ತದೆ” ಎನ್ನುವುದು ನಮ್ಮ ಪ್ರಾಚೀನರು ಕಂಡುಕೊಂಡ ಸತ್ಯವಾಗಿತ್ತು. ಅತಿಥಿ ರೂಪದಲ್ಲಿ ಭಗವಂತ ಬೆಂಕಿಯಾಗಿ ಮನೆಗೆ ಬಂದಾಗ, ಮೊದಲು ಮೂರು ಬಗೆಯ ನೀರನ್ನು ಕೊಟ್ಟು ಬೆಂಕಿಯನ್ನು ಶಾಂತಗೊಳಿಸಬೇಕು. ಕೈ ತೊಳೆಯುವ ನೀರು-ಅರ್ಘ್ಯ, ಕಾಲು ತೊಳೆಯುವ ನೀರು-ಪಾದ್ಯ ಮತ್ತು ಕುಡಿಯುವ ನೀರು-ಆಚಮನ. ಇಲ್ಲಿ ಒಬ್ಬ ಜ್ಞಾನಿ ಅತಿಥಿಯಾಗಿ ಬಂದು ಯಮನಿಗಾಗಿ ಕಾದು ಕುಳಿತಿದ್ದಾನೆ. ಅದಕ್ಕಾಗಿ ಯಮನ ಹೆಂಡತಿ ಕಾದು ಕುಳಿತಿರುವ ಅತಿಥಿಯ ಸತ್ಕಾರ ಮಾಡಿ ಆತನ ಹೊಟ್ಟೆಯಲ್ಲಿನ ಅಗ್ನಿಯನ್ನು ತಣಿಸು” ಎಂದು ವಿವಸ್ವತನ(ಸೂರ್ಯನ) ಮಗನಾದ ಯಮನಿಗೆ ಹೇಳುತ್ತಾಳೆ.[ಕೆಲವು ಅನುವಾದಕಾರರು ಈ ಮಾತನ್ನು ಯಮನ ಮಂತ್ರಿಗಳು ಹೇಳಿದರು ಎಂದು ಬರೆಯುತ್ತಾರೆ. ಆದರೆ ಹಿಂದೆ ಹೇಳಿದಂತೆ ನಾವು ಮಹಾಭಾರತ, ತೈತ್ತಿರೀಯ ಬ್ರಾಹ್ಮಣ ಮತ್ತು ಪುರಾಣದಲ್ಲಿ ಬರುವ ನಚಿಕೇತನ</w:t>
       </w:r>
     </w:p>
     <w:p>
@@ -1093,7 +1077,7 @@
           <w:i/>
           <w:sz w:val="20"/>
         </w:rPr>
-        <w:t>ಆಧಾರ: ಬನ್ನಂಜೆ ಗೋವಿಂದಾಚಾರ್ಯ ಉಪನಿಷತ್ ಪ್ರವಚನ    Page 11</w:t>
+        <w:t>ಆಧಾರ: ಬನ್ನಂಜೆ ಗೋವಿಂದಾಚಾರ್ಯರ ಉಪನಿಷತ್ ಪ್ರವಚನ Page 11</w:t>
       </w:r>
     </w:p>
     <w:p>
@@ -1120,39 +1104,39 @@
         <w:spacing w:line="276" w:lineRule="auto" w:after="120"/>
       </w:pPr>
       <w:r>
-        <w:t>ಕಥೆಯನ್ನು ಸಮಗ್ರವಾಗಿ ನೋಡಿದಾಗ- ಈ ಮಾತನ್ನು ಯಮನ ಪತ್ನಿ-ಮಾತ್ರ ಹೇಳಿರುವದು ಸ್ಪಷ್ಟವಾಗುತ್ತದೆ].</w:t>
-      </w:r>
-    </w:p>
-    <w:p>
-      <w:pPr>
-        <w:spacing w:line="276" w:lineRule="auto" w:after="120"/>
-      </w:pPr>
-      <w:r>
-        <w:t>ಆಶಾಪ್ರತೀಕ್ಷೇ ಸಂಗತꣳ ಸೂನೃತಾಂ ಚೇಷ್ಟಾಪೂರ್ತೇ ಪುತ್ರಪಶೂꣳಶ್ಚ ಸರ್ವಾನ್ |</w:t>
-      </w:r>
-    </w:p>
-    <w:p>
-      <w:pPr>
-        <w:spacing w:line="276" w:lineRule="auto" w:after="120"/>
-      </w:pPr>
-      <w:r>
-        <w:t>ಏತದ್ ವೃಂಕ್ತೇ ಪುರುಷಸ್ಯಾಲ್ಪಮೇಧಸೋ ಯಸ್ಯಾನಶ್ನನ್ ವಸತಿ ಬ್ರಾಹ್ಮಣೋ ಗೃಹೇ ॥೮॥</w:t>
-      </w:r>
-    </w:p>
-    <w:p>
-      <w:pPr>
-        <w:spacing w:line="276" w:lineRule="auto" w:after="120"/>
-      </w:pPr>
-      <w:r>
-        <w:t>ಹಸಿದು ಬಂದ ಅತಿಥಿಯನ್ನು ಸತ್ಕಾರ ಸ್ವೀಕರಿಸುವದರ ಪರಿಣಾಮ ಏನು ಎನ್ನುವದನ್ನು ಈ ಶ್ಲೋಕದಲ್ಲಿ ಯಮನ ಪತ್ನಿ ವಿವರಿಸುತ್ತಾಳೆ. "ಒಂದು ವೇಳೆ ಅತಿಥಿಯನ್ನು ತೃಪ್ತಿಕರಿಸಿ ಕಳುಹಿಸದ ಎಡೆ ಆ ಮನೆಯ ಆಶಾಪ್ರತೀಕ್ಷೆಗಳು ಮಣ್ಣುಪಾಲಾಗುತ್ತವೆ, ಮಕ್ಕಳು ಬಂಧನದಿಂದ ದೂರ ಆಗುತ್ತಾರೆ, ಯಾರೂ ನಿನ್ನನ್ನು ಕೂಡ ಒಳ್ಳಿಯ ಮಾತಾಡುವದಿಲ್ಲ. ಮನೆ ಇಷ್ಟ-ಪೂರ್ತ-ಸರ್ವಸ್ವ ನಾಶ ಆಗುತ್ತ" ಎನ್ನುತ್ತಾರೆ. ಇಲ್ಲಿ 'ಇಷ್ಟ' ಎಂದರೆ ನಮ್ಮ ಒಳ್ಳೆವಾಗಿ ಯಾಗ ಮಾಡುವ ಮತ್ತು 'ಪೂರ್ತ' ಎಂದರೆ ಸಮಾಜದ ಋಣವನ್ನು ತೀರಿಸುವ ದ ಒ ಸ ರ ಮಾಡುವ. ಒಟ್ಟು ಆರು ಇಷ್ಟಗಳು ಹಾಗೂ ಆರು ಪೂರ್ತಗಳನ್ನು ಶಾಸ್ತ್ರಕಾರರು ಪ್ರಕಟಿಸಿದ್ದಾರೆ. "ಅಗ್ನಿಹೋತ್ರಂ ತಪಃ ಸತ್ಯಂ ವೇದಾನಾಂ ಅನುಪಾಲನಂ ಆತಿಥ್ಯಂ ವೈಶ್ವಾನರೇವಂ ಚ ಇಷ್ಟಂ ಇತಿ ಅಭಿಹಿತಂ" – (೧) ಅಗ್ನಿ ಮುಖದ ಆರಾಧನ (ಅಗ್ನಿಹೋತ್ರ), (೨) ಉಪವಾಸ, ಬ್ರಹ್ಮಚರ್ಯ, ಇತ್ಯಾದಿ ಸ್ತ್ರೈಲಿಕ ಜೀವನ ಬದುಕುವದು(ತಪಃ), (೩) ಸ್ವಾಭಾವಿಕ ಆದ ಬದುಕು(ಸತ್ಯ), (೪) ನಿರಂತರ ವೇದಾಧ್ಯಯನ ಹಾಗೂ ವೇದಲೋಕ ಕ್ರಮ ಅನುಪಾಲನ, (೫) ಹಸಿದವರ ಅನ್ನ ಸ್ವೀಕರಿಸುವದು(ಆತಿಥ್ಯ), (೬) ಜೀವ ಜ್ಯೋತಿಗಳ ಆತಿಥ್ಯ –ಇವ ಆರು ಇಷ್ಟಗಳು. ಹಾಗೇ (೧) ಸಮಾಜದ ಉಪಯೋಗಕ್ಕಾಗಿ ನೀರು ಒಸರಿಸುವದು, (೨) ಇಷ್ಟಿಕಾಯನ್ನು ಕಟ್ಟುವದು, (೩) ವ್ಯಾನಕ ಯನ್ನು ಕಟ್ಟುವದು, (೪) ಊರ ಚೌಮು ರ ಒಸರಿ ಜೀವ ನ ಕಟ್ಟುವದು, (೫) ಪ್ರಾವ್ರಾಜಕ ಅನ್ನ ದಾನ ಮತ್ತು (೬) ಕಡ ಮರಗಳನ್ನು ಬೆಳೆಸುವದು- ಇವ ಆರು ಪೂರ್ತಗಳು. ಇಲ್ಲಿ ಯಮನ ಪತ್ನಿ ಹೇಳುತ್ತಾಳೆ: "ಒಂದು ವೇಳೆ ಅತಿಥಿಯನ್ನು ತೃಪ್ತಿ ಪಡಿಸದ ಅದ ರಿಂದ ಇಷ್ಟ ಮತ್ತು ಪೂರ್ತಗಳ ಎಲ್ಲಾ ಪ್ರಣ ಫಲಗಳೂ ನಷ್ಟ ಆಗುತ್ತ" ಎಂದು.</w:t>
-      </w:r>
-    </w:p>
-    <w:p>
-      <w:pPr>
-        <w:spacing w:line="276" w:lineRule="auto" w:after="120"/>
-      </w:pPr>
-      <w:r>
-        <w:t>ತಿಸ್ರೋ ರಾತ್ರೀರ್ಯದವಾತ್ಸೀꣳ ಗೃಹೇ ಮೇSನಶ್ನನ್ ಬ್ರಹ್ಮನ್ ಅತಿಥಿರ್ನಮಸ್ತಃ |</w:t>
+        <w:t>ಕಥೆಯನ್ನು ಸಮಷ್ಟಿಯಾಗಿ ನೋಡಿದಾಗ- ಈ ಮಾತನ್ನು ಯಮನ ಪತ್ನಿ-ಶ್ಯಾಮಲ ಹೇಳಿರುವುದು ಸ್ಪಷ್ಟವಾಗುತ್ತದೆ].</w:t>
+      </w:r>
+    </w:p>
+    <w:p>
+      <w:pPr>
+        <w:spacing w:line="276" w:lineRule="auto" w:after="120"/>
+      </w:pPr>
+      <w:r>
+        <w:t>ಆಶಾಪ್ರತೀಕ್ಷೇ ಸಂಗತಂ ಸೂನೃತಾಂ ಚೇಷ್ಟಾಪೂರ್ತೇ ಪುತ್ರಪಶೂಂಶ್ಚ ಸರ್ವಾನ್ |</w:t>
+      </w:r>
+    </w:p>
+    <w:p>
+      <w:pPr>
+        <w:spacing w:line="276" w:lineRule="auto" w:after="120"/>
+      </w:pPr>
+      <w:r>
+        <w:t>ಏತದ್ವೃಂಕ್ತೇ ಪುರುಷಸ್ಯಾಲ್ಪಮೇಧಸೋ ಯಸ್ಯಾನಶ್ನನ್ ವಸತಿ ಬ್ರಾಹ್ಮಣೋ ಗೃಹೇ ॥೮॥</w:t>
+      </w:r>
+    </w:p>
+    <w:p>
+      <w:pPr>
+        <w:spacing w:line="276" w:lineRule="auto" w:after="120"/>
+      </w:pPr>
+      <w:r>
+        <w:t>ಹಸಿದು ಬಂದ ಅತಿಥಿಯನ್ನು ಸತ್ಕರಿಸದೆ ತಿರಸ್ಕರಿಸುವುದರ ಪರಿಣಾಮ ಏನು ಎನ್ನುವುದನ್ನು ಈ ಶ್ಲೋಕದಲ್ಲಿ ಯಮನ ಪತ್ನಿ ವಿವರಿಸುತ್ತಾಳೆ. “ಒಂದು ವೇಳೆ ಅತಿಥಿಯನ್ನು ಬೈದು ಕಳುಹಿಸಿದರೆ ನಿಮ್ಮ ಆಶಾ ಪ್ರತೀಕ್ಷೆಗಳು ಮಣ್ಣುಪಾಲಾಗುತ್ತವೆ, ಗೆಳೆಯರು ನಿಮ್ಮಿಂದ ದೂರವಾಗುತ್ತಾರೆ, ಯಾರೂ ನಿಮ್ಮನ್ನು ನೋಡಿ ಒಳ್ಳೆಯ ಮಾತನಾಡಾಡುವುದಿಲ್ಲ. ನಿಮ್ಮ ಇಷ್ಟಾ-ಪೂರ್ತಾ-ಸರ್ವಸ್ವವೂ ನಾಶವಾಗುತ್ತದೆ” ಎನ್ನುತ್ತಾಳೆ ಆಕೆ. ಇಲ್ಲಿ ‘ಇಷ್ಟಾ’ ಎಂದರೆ ನಮ್ಮ ಬೆಳವಣಿಗೆಗಾಗಿ ನಾವು ಮಾಡುವ ಕ್ರಿಯೆ ಮತ್ತು ‘ಪೂರ್ತಾ’ ಎಂದರೆ ಸಮಾಜದ ಋಣವನ್ನು ತೀರಿಸುವುದಕ್ಕೋಸ್ಕರ ಮಾಡುವ ಕ್ರಿಯೆ. ಒಟ್ಟು ಆರು ಇಷ್ಟಗಳು ಹಾಗೂ ಆರು ಪೂರ್ತಗಳನ್ನು ಶಾಸ್ತ್ರಕಾರರು ಪಟ್ಟಿ ಮಾಡಿದ್ದಾರೆ. “ಅಗ್ನಿಹೋತ್ರಂ ತಪಃ ಸತ್ಯಂ ವೇದಾನಾಂಚಾನುಪಾಲನಂ ಆತಿಥ್ಯಂ ವೈಶ್ವದೇವಂ ಚ ಇಷ್ಟಂ ಇತಿ ಅಭಿಧೀಯತೇ” – (೧) ನಿತ್ಯ ಅಗ್ನಿ ಮುಖದ ಆರಾಧನೆ(ಅಗ್ನಿಹೋತ್ರ), (೨) ಉಪವಾಸ, ಬ್ರಹ್ಮಚರ್ಯ, ಇತ್ಯಾದಿ ನೈಷ್ಠಿಕ ಜೀವನ ಬದುಕುವುದು(ತಪಃ), (೩) ಪ್ರಾಮಾಣಿಕವಾದ ಬದುಕು(ಸತ್ಯ), (೪) ನಿರಂತರ ವೇದಾಧ್ಯಯನ ಹಾಗೂ ವೇದೋಕ್ತ ಕರ್ಮಾನುಷ್ಠಾನ, (೫) ಹಸಿದವರಿಗೆ ಅನ್ನ ನೀಡಿ ಸತ್ಕರಿಸುವುದು(ಆತಿಥ್ಯ), (೬) ದೇವತೆಗಳ ಆತಿಥ್ಯ –ಇವು ಆರು ಇಷ್ಟಗಳು. ಹಾಗೇ (೧) ಸಮಾಜದ ಉಪಯೋಗಕ್ಕಾಗಿ ಬಾವಿ ತೋಡಿಸುವುದು, (೨) ಇಳೀಬಾವಿಯನ್ನು ಕಟ್ಟುವುದು, (೩) ಸ್ನಾನದ ಕೆರೆಯನ್ನು ಕಟ್ಟುವುದು, (೪) ಊರಿನ ಕ್ಷೇಮಕ್ಕೋಸ್ಕರ ದೇವಸ್ಥಾನ ಕಟ್ಟುವುದು, (೫) ಸಾರ್ವಜನಿಕ ಅನ್ನದಾನ ಮತ್ತು (೬) ಗಿಡ ಮರಗಳನ್ನು ಬೆಳೆಸುವುದು- ಇವು ಆರು ಪೂರ್ತಗಳು. ಇಲ್ಲಿ ಯಮನ ಪತ್ನಿ ಹೇಳುತ್ತಾಳೆ: “ಒಂದು ವೇಳೆ ಅತಿಥಿಯನ್ನು ತಿರಸ್ಕರಿಸಿದರೆ ಅದರಿಂದ ಇಷ್ಟ ಮತ್ತು ಪೂರ್ತದ ಎಲ್ಲಾ ಪುಣ್ಯ ಫಲಗಳೂ ನಷ್ಟವಾಗುತ್ತದೆ” ಎಂದು.</w:t>
+      </w:r>
+    </w:p>
+    <w:p>
+      <w:pPr>
+        <w:spacing w:line="276" w:lineRule="auto" w:after="120"/>
+      </w:pPr>
+      <w:r>
+        <w:t>ತಿಸ್ರೋ ರಾತ್ರೀರ್ಯದವಾತ್ಸೀರ್ಗೃಹೇ ಮೇSನಶ್ನನ್ ಬ್ರಹ್ಮನ್ನತಿಥಿರ್ನಮಸ್ಯಃ |</w:t>
       </w:r>
     </w:p>
     <w:p>
@@ -1168,7 +1152,7 @@
         <w:spacing w:line="276" w:lineRule="auto" w:after="120"/>
       </w:pPr>
       <w:r>
-        <w:t>ತನಗಾಗಿ ಅನ್ನ-ನೀರನ್ನು ಬಿಟ್ಟು ಕಾಯುತ್ತಿದ್ದ ನಚಿಕೇತನನ್ನು ಕುರಿತು ಯಮ ಹೇಳುತ್ತಾನೆ: "ತಂದೆಯ ಅಣತಿಯಿಂದ ನನ್ನನ್ನು ಕಾಣಲು ಬಂದ ನೀನು ನನ್ನ ಅತಿಥಿ. ಹೀಗಿರುವಾಗ ಅತಿಥಿಯನ್ನು ಮೂರು ದಿನ ಕಾಯಿಸಿದ ಪಾಪ ನನಗೆ ಬಂತು" ಎಂದು. "ನನ್ನ ಗೃಹದಲ್ಲಿ ನನ್ನ ಅತಿಥಿ ಉಪವಾಸ ಕುಳಿತ ನಮ್ಮ ಕಾರ್ಯ ಯೋಗ ಹಾಳಾ ತ್ತೀನಿ. ನನ್ನಿಂದ ಅಷ್ಟೂ ಒಡ ಅಪರಾಧ ಆಗ್ತ. ನಿ ನಾ ದ</w:t>
+        <w:t>ತನಗಾಗಿ ಅನ್ನ-ನೀರನ್ನು ಬಿಟ್ಟು ಕಾಯುತ್ತಿದ್ದ ನಚಿಕೇತನನ್ನು ಕುರಿತು ಯಮ ಹೇಳುತ್ತಾನೆ: “ತಂದೆಯ ಅಣತಿಯಂತೆ ನನ್ನನ್ನು ಕಾಣಲು ಬಂದ ನೀನು ನನಗೆ ಅತಿಥಿ. ಹೀಗಿರುವಾಗ ಅತಿಥಿಯನ್ನು ಮೂರು ದಿನ ಕಾಯಿಸಿದ ಪಾಪ ನನಗೆ ಬಂತು” ಎಂದು. “ನನ್ನ ಗೃಹದಲ್ಲಿ ನನ್ನ ಅತಿಥಿಯಾಗಿ ಉಪವಾಸ ಕುಳಿತ ನಮಸ್ಕಾರ ಯೋಗ್ಯ ಜ್ಞಾನಿ ನೀನು. ನಮ್ಮಿಂದ ಅದೆಷ್ಟು ದೊಡ್ಡ ಅಪರಾಧವಾಗಿ ಹೋಗಿದೆ. ನಿನ್ನ ಕಾಲಿಗೆ ಬಿದ್ದು ಕ್ಷಮೆ ಕೇಳಬೇಕು ನಾವು. ನಿನಗೆ ನನ್ನ ನಮಸ್ಕಾರ” ಎನ್ನುತ್ತಾನೆ ಯಮ.</w:t>
       </w:r>
     </w:p>
     <w:p>
@@ -1181,7 +1165,7 @@
           <w:i/>
           <w:sz w:val="20"/>
         </w:rPr>
-        <w:t>ಆಧಾರ: ಬನ್ನಂಜೆ ಗೋವಿಂದಾಚಾರ್ಯ ಉಪನಿಷತ್ ಪ್ರವಚನ    Page 12</w:t>
+        <w:t>ಆಧಾರ: ಬನ್ನಂಜೆ ಗೋವಿಂದಾಚಾರ್ಯರ ಉಪನಿಷತ್ ಪ್ರವಚನ Page 12</w:t>
       </w:r>
     </w:p>
     <w:p>
@@ -1208,7 +1192,7 @@
         <w:spacing w:line="276" w:lineRule="auto" w:after="120"/>
       </w:pPr>
       <w:r>
-        <w:t>ಹೇಳಬೇಕು ನಾವು. 'ನಿನ್ನನ್ನು ನಮಸ್ಕಾರ' ಎನ್ನುತ್ತಾ ಯಮ. ಎಷ್ಟು ದೊಡ್ಡ ಮಾತು! ಪೂರ್ಣ ಪಾಪಗಳ ಫಲದಾಯಕನಾಗಿ ದುಃಖವನೂ ಪೂರ್ಣ ಪುಣ್ಯಗಳ ಫಲದಾಯಕನಾಗಿ ಸುಖವನೂ ಕೊಡುವ, ಲೋಕದ ಸುಖ-ದುಃಖಗಳ ನಾಮಕ ದೇವ ಯಮ ಇಲ್ಲಿ 'ನನ್ನ ಅಪರಾಧವನ್ನು ಕ್ಷಮಿಸು, ನಿನ್ನನ್ನು ನಮಸ್ಕಾರ' ಎನ್ನುತ್ತಾ. ಇದು ಭಕ್ತರ ದೊಡ್ಡ ಗುಣ. 'ಶ್ರದ್ಧಾವಾನ್ ಲಭತೇ ಜ್ಞಾನಂ(೪-೩೯)' ಎಂದು ಕೃಷ್ಣ ಗೀತೆಯಲ್ಲಿ ಹೇಳಿ ಇರುವಂತೆ - ಭಕ್ತರನ್ನು ಅಪಮಾನಿಸಿದರೆ ಅದು ಭಗವಂತನನ್ನು ಅಪಮಾನಿಸಿದಂತೆ. ಭಕ್ತರು ಭಗವಂತನ ಪರಮ ಪರಿವಾರರು. ಈ ಕಾರಣದಿಂದ ಭಕ್ತರನ್ನು ಕಾಯಿಸಿದರೆ ಇಲ್ಲಿ ಯಮ ಹೇಳುತ್ತಾ. 'ನನ್ನ ಅನಿಷ್ಟ ಆಗದಂತೆ ಹರಸು; ಅಷ್ಟೇ ಅಲ್ಲ, ನಿನ್ನನ್ನು ಮೂರು ದಿನ ಕಾಯಿಸಿದ್ದಕ್ಕೆ ನೀನು ಬಯಸಿದ ಮೂರು ವರವನ್ನು ಕೊಡುತ್ತೇನೆ – ಏನು ಬೇಕಾದರೂ ಕೇಳು' ಎನ್ನುತ್ತಾ ಯಮ.</w:t>
+        <w:t>ಎಷ್ಟು ದೊಡ್ಡ ಮಾತು! ಪುಣ್ಯ ಪಾಪಗಳ ನಿರ್ಣಯ ಮಾಡಿ ಪಾಪಿಗಳಿಗೆ ದುಃಖವನ್ನೂ ಪುಣ್ಯಜೀವಿಗಳಿಗೆ ಸುಖವನ್ನೂ ಕೊಡುವ, ಲೋಕದ ಸುಖ-ದುಃಖಗಳ ನಿಯಾಮಕ ದೇವತೆ ಯಮ ಇಲ್ಲಿ “ನನ್ನ ಅಪರಾಧವನ್ನು ಕ್ಷಮಿಸು, ನಿನಗೆ ನಮಸ್ಕಾರ” ಎನ್ನುತ್ತಿದ್ದಾನೆ. ಇದು ಹಿರಿಯರ ದೊಡ್ಡ ಗುಣ. ಶ್ರದ್ಧಾವಾನ್ ಲಭತೇ ಜ್ಞಾನಂ(೪-೩) ಎಂದು ಕೃಷ್ಣ ಗೀತೆಯಲ್ಲಿ ಹೇಳಿರುವಂತೆ-ಜ್ಞಾನಿಗಳಿಗೆ ಅಪಮಾನ ಮಾಡಿದರೆ ಅದು ಭಗವಂತನನ್ನು ಅಪಮಾನ ಮಾಡಿದಂತೆ. ಜ್ಞಾನಿಗಳು ಭಗವಂತನಿಗೆ ಪರಮ ಪ್ರಿಯರು. ಈ ಕಾರಣದಿಂದ ಜ್ಞಾನಿಯನ್ನೂ ಕಾಯಿಸಿದ್ದಕ್ಕೆ ಇಲ್ಲಿ ಯಮ ಕ್ಷಮೆ ಕೇಳುತ್ತಿದ್ದಾನೆ. “ನನಗೆ ಅನಿಷ್ಟವಾಗದಂತೆ ಹರಸು; ಅಷ್ಟೇ ಅಲ್ಲ, ನಿನ್ನನ್ನು ಮೂರು ದಿನ ಕಾಯಿಸಿದ್ದಕ್ಕಾಗಿ ನೀನು ಬಯಸಿದ ಮೂರು ವರವನ್ನು ಕೊಡುತ್ತೇನೆ –ಏನು ಬೇಕಾದರೂ ಕೇಳು” ಎನ್ನುತ್ತಾನೆ ಯಮ.</w:t>
       </w:r>
     </w:p>
     <w:p>
@@ -1224,23 +1208,23 @@
         <w:spacing w:line="276" w:lineRule="auto" w:after="120"/>
       </w:pPr>
       <w:r>
-        <w:t>ತ್ವತ್ಪ್ರಸೃಷ್ಟಂ ಮಾSಭಿವದೇತ್ಪ್ರತೀತ ಏತತ್ ತ್ರಯಾಣಾಂ ಪ್ರಥಮಂ ವರಂ ವೃಣೇ ॥೧೦॥</w:t>
-      </w:r>
-    </w:p>
-    <w:p>
-      <w:pPr>
-        <w:spacing w:line="276" w:lineRule="auto" w:after="120"/>
-      </w:pPr>
-      <w:r>
-        <w:t>ನಚಿಕೇತ ಯಮನ ಹೇಳುವ ಮದಲ ವರವನ್ನು ಈ ಶ್ಲೋಕದಲ್ಲಿ ವಿವರಿಸುತ್ತಾರೆ. 'ನಾನು ಪುನಃ ನನ್ನ ತಂದೆಗೆ ಮಗನಾಗಿ ಅದೇ ದೇಹದಲ್ಲಿ ಹುಟ್ಟಬೇಕು; ನನ್ನ ತಂದೆ ಸತು ಬದುಕಿದ ನನ್ನನ್ನು ಗುರುತಿಸಬೇಕು; ನನ್ನನ್ನು ನೋಡಿ ಸಂತೋಷಪಡಬೇಕು; ಒಳ್ಳೆಯ ಮಾತಾಡಿ ಪ್ರೀತಿಯಿಂದ ಆರೈಕೆ ಸಲ್ಲಿಸಬೇಕು; ನನ್ನ ತಂದೆ 'ಬಿಟ್ಟಿದನು ಮಾಡುವ' ಬಯಕೆ ಎಂದೂ ಬರಬಾರದು; ಆತನ ಮನಸ್ಸು ಸದಾ ಒಳ್ಳೆಯ ಕೆಲಸ ಮಾಡಲು ಚಡಪಡಿಸಬೇಕು ಮತ್ತು ಆತ ಎಂದೂ ಕೋಪ ಮಾಡಬಾರದು' ಎಂದು ನಚಿಕೇತ ಯಮನನ್ನು ಹೇಳುತ್ತಾ. ಇದು ನಚಿಕೇತ ಹೇಳುವ ಮದಲ ವರ.</w:t>
-      </w:r>
-    </w:p>
-    <w:p>
-      <w:pPr>
-        <w:spacing w:line="276" w:lineRule="auto" w:after="120"/>
-      </w:pPr>
-      <w:r>
-        <w:t>ಯಥಾ ಪುರಸ್ತಾದ್ ಭವಿತಾ ಪ್ರತೀತ ಔದ್ದಾಲಕಿರಾರುಣಿರ್ಮತ್ ಪ್ರಸೃಷ್ಟಃ |</w:t>
+        <w:t>ತ್ವತ್ಪ್ರಸೃಷ್ಟೋ ಮಾSಭಿವದೇತ್ಪ್ರತೀತ ಏತತ್ ತ್ರಯಾಣಾಂ ಪ್ರಥಮಂ ವರಂ ವೃಣೇ ॥೧೦॥</w:t>
+      </w:r>
+    </w:p>
+    <w:p>
+      <w:pPr>
+        <w:spacing w:line="276" w:lineRule="auto" w:after="120"/>
+      </w:pPr>
+      <w:r>
+        <w:t>ನಚಿಕೇತ ಯಮನಲ್ಲಿ ಕೇಳುವ ಮೊದಲ ವರವನ್ನು ಈ ಶ್ಲೋಕದಲ್ಲಿ ವರ್ಣಿಸಲಾಗಿದೆ. “ನಾನು ಪುನಃ ನನ್ನ ತಂದೆಗೆ ಮಗನಾಗಿ ಅದೇ ದೇಹದಲ್ಲಿ ಹುಟ್ಟಬೇಕು; ನನ್ನ ತಂದೆ ಸತ್ತು ಬದುಕಿದ ನನ್ನನ್ನು ಗುರುತಿಸಬೇಕು; ನನ್ನನ್ನು ನೋಡಿ ಸಂತೋಷಪಡಬೇಕು; ಒಳ್ಳೆಯ ಮಾತನಾಡಿ ಸ್ವಾಗತಿಸಬೇಕು; ನನ್ನ ತಂದೆಗೆ ‘ಕೆಟ್ಟದ್ದನ್ನು ಮಾಡುವ’ ಬಯಕೆ ಎಂದೂ ಬರಬಾರದು; ಆತನ ಮನಸ್ಸು ಸದಾ ಒಳ್ಳೆಯ ಕೆಲಸ ಮಾಡಲು ಚಡಪಡಿಸಬೇಕು ಮತ್ತು ಆತ ಎಂದೂ ಕೋಪ ಮಾಡಬಾರದು” ಎಂದು ನಚಿಕೇತ ಯಮನನ್ನು ಕೇಳುತ್ತಾನೆ. ಇದು ನಚಿಕೇತ ಕೇಳುವ ಮೊದಲ ವರ.</w:t>
+      </w:r>
+    </w:p>
+    <w:p>
+      <w:pPr>
+        <w:spacing w:line="276" w:lineRule="auto" w:after="120"/>
+      </w:pPr>
+      <w:r>
+        <w:t>ಯಥಾ ಪುರಸ್ತಾದ್ ಭವಿತಾ ಪ್ರತೀತ ಔದ್ದಾಲಕಿರಾರುಣಿರ್ಮತ್ಪ್ರಸೃಷ್ಟಃ |</w:t>
       </w:r>
     </w:p>
     <w:p>
@@ -1256,15 +1240,15 @@
         <w:spacing w:line="276" w:lineRule="auto" w:after="120"/>
       </w:pPr>
       <w:r>
-        <w:t>ನಚಿಕೇತ ಕೇಳಿದ ವರವನ್ನು ಯಮ ಪರಿಹರಿಸುತ್ತಾ ಮತ್ತು ಹೇಳುತ್ತಾ: 'ನೀನು ಮರಳಿದ ಮೇಲೆ ನನ್ನ ತಂದೆ ನನ್ನನ್ನು ಅದೇ ಸಂತೋಷದಿಂದ ಗುರುತಿಸುತ್ತಾ. ನನ್ನನ್ನು ಪ್ರೀತಿಯಿಂದ ಆರೈಕೆ ಸಲ್ಲಿಸುತ್ತಾ. ಮರಣದಿಂದ ಬಂದ ನನ್ನನ್ನು ಕಂಡೇ ಆತನ ಕೋಪ ನಾಶ ಆಗಿ ಆತ ಶಾಂತನಾಗುತ್ತಾ ಮತ್ತು ಆತ ನಿಜದ ಸುಖವನ್ನು ಪಡೆಯುತ್ತಾ' ಎಂದು.</w:t>
-      </w:r>
-    </w:p>
-    <w:p>
-      <w:pPr>
-        <w:spacing w:line="276" w:lineRule="auto" w:after="120"/>
-      </w:pPr>
-      <w:r>
-        <w:t>ಇಲ್ಲಿ ಉದ್ದಾಲಕನನ್ನು ಔದ್ದಾಲಕಿ ಆರುಣಿ ಎಂದು ಕರೆಯಲಾಗಿದೆ. ಔದ್ದಾಲಕಿ ಎಂದರೆ ಉದ್ದಾಲಕನ ಮಗನು. ಹಿಂದೆ ಅಜ್ಜನ ಸಂಪ್ರದಾಯದಲ್ಲಿ ಇಡುವದು ಸಂಪ್ರದಾಯ ಆಗಿತ್ತು. ಇಲ್ಲಿ ಉದ್ದಾಲಕನ ತಂದೆಯ ಸಂಪ್ರದಾಯದ ಸಮಸ್ತರೂ ಉದ್ದಾಲಕ ಎನ್ನುವದನ್ನು ನಾವು ಗಮನಿಸಬೇಕು. ಅರುಣನ ಮಗನಾಗೂ ಉದ್ದಾಲಕನ ಮಗನಾದ ನಚಿಕೇತನ ತಂದೆ - ಔದ್ದಾಲಕಿ ಆರುಣಿ.</w:t>
+        <w:t>ನಚಿಕೇತ ಕೇಳಿದ ವರವನ್ನು ಯಮ ಪುರಸ್ಕರಿಸುತ್ತಾನೆ ಮತ್ತು ಹೇಳುತ್ತಾನೆ: “ನೀನು ಹಿಂದಿರುಗಿ ಹೋದಾಗ ನಿನ್ನ ತಂದೆ ನಿನ್ನನ್ನು ಅಷ್ಟೇ ಸ್ಪಷ್ಟವಾಗಿ ಗುರುತಿಸುತ್ತಾನೆ. ನಿನ್ನನ್ನು ಪ್ರೀತಿಯಿಂದ ಸ್ವಾಗತಿಸುತ್ತಾನೆ. ಮರಣದಿಂದ ಬಂದ ನಿನ್ನನ್ನು ಕಂಡ ಮೇಲೆ ಆತನ ಕೋಪ ನಾಶವಾಗಿ ಆತ ಶಾಂತನಾಗುತ್ತಾನೆ ಮತ್ತು ಆತ ರಾತ್ರಿ ಸುಖನಿದ್ದೆಯನ್ನು ಪಡೆಯುತ್ತಾನೆ” ಎಂದು.</w:t>
+      </w:r>
+    </w:p>
+    <w:p>
+      <w:pPr>
+        <w:spacing w:line="276" w:lineRule="auto" w:after="120"/>
+      </w:pPr>
+      <w:r>
+        <w:t>ಇಲ್ಲಿ ಉದ್ದಾಲಕನನ್ನು ಔದ್ದಾಲಕಿ ಆರುಣಿ ಎಂದು ಕರೆದಿದ್ದಾರೆ. ಔದ್ದಾಲಕಿ ಎಂದರೆ ಉದ್ದಾಲಕನ ಮೊಮ್ಮಗ. ಹಿಂದೆ ಅಜ್ಜನ ಹೆಸರನ್ನು ಮೊಮ್ಮಗನಿಗೆ ಇಡುವುದು ಸಂಪ್ರದಾಯವಾಗಿತ್ತು. ಇಲ್ಲಿ ಉದ್ದಾಲಕನ ತಾತನ ಹೆಸರೂ ಉದ್ದಾಲಕ ಎನ್ನುವುದನ್ನು ನಾವು ಗಮನಿಸಬೇಕು. ಅರುಣನ ಮಗ ಹಾಗೂ ಉದ್ದಾಲಕನ ಮೊಮ್ಮಗನಾದ ನಚಿಕೇತನ ತಂದೆ- ಔದ್ದಾಲಕಿ ಆರುಣಿ.</w:t>
       </w:r>
     </w:p>
     <w:p>
@@ -1277,7 +1261,7 @@
           <w:i/>
           <w:sz w:val="20"/>
         </w:rPr>
-        <w:t>ಆಧಾರ: ಬನ್ನಂಜೆ ಗೋವಿಂದಾಚಾರ್ಯ ಉಪನಿಷತ್ ಪ್ರವಚನ    Page 13</w:t>
+        <w:t>ಆಧಾರ: ಬನ್ನಂಜೆ ಗೋವಿಂದಾಚಾರ್ಯರ ಉಪನಿಷತ್ ಪ್ರವಚನ Page 13</w:t>
       </w:r>
     </w:p>
     <w:p>
@@ -1304,55 +1288,55 @@
         <w:spacing w:line="276" w:lineRule="auto" w:after="120"/>
       </w:pPr>
       <w:r>
-        <w:t>ಸ್ವರ್ಗ ಲೋಕೇ ನ ಭಯಂ ಕಿಂಚನಾಸ್ತಿ  ನ ತತ್ರ ತ್ವಂ ನ ಜರಯಾ ಬಿಭೇತಿ |</w:t>
-      </w:r>
-    </w:p>
-    <w:p>
-      <w:pPr>
-        <w:spacing w:line="276" w:lineRule="auto" w:after="120"/>
-      </w:pPr>
-      <w:r>
-        <w:t>ಉಭೇ ತೀರ್ತ್ವಾ ಅಶನಾಯಾಪಿಪಾಸೇ  ಶೋಕಾತಿಗೋ ಮೋದತೇ ಸ್ವರ್ಗಲೋಕೇ ॥೧೨॥</w:t>
-      </w:r>
-    </w:p>
-    <w:p>
-      <w:pPr>
-        <w:spacing w:line="276" w:lineRule="auto" w:after="120"/>
-      </w:pPr>
-      <w:r>
-        <w:t>ಸ ತ್ವಮಗ್ನಿꣳ ಸ್ವರ್ಗಮಧ್ಯೇಷಿ ಮೃತ್ಯೋ  ಪ್ರಬ್ರೂಹಿ ತ್ವꣳ ಶ್ರದ್ದಧಾನಾಯ ಮಹ್ಯಂ |</w:t>
-      </w:r>
-    </w:p>
-    <w:p>
-      <w:pPr>
-        <w:spacing w:line="276" w:lineRule="auto" w:after="120"/>
-      </w:pPr>
-      <w:r>
-        <w:t>ಸ್ವರ್ಗ ಲೋಕಾ ಅಮೃತತ್ವಂ ಭಜಂತ  ಏತದ್ ದ್ವಿತೀಯೇನ ವೃಣೇ ವರೇಣ ॥೧೩॥</w:t>
-      </w:r>
-    </w:p>
-    <w:p>
-      <w:pPr>
-        <w:spacing w:line="276" w:lineRule="auto" w:after="120"/>
-      </w:pPr>
-      <w:r>
-        <w:t>ಇಲ್ಲಿ 'ಸ್ವರ್ಗ ಲೋಕೇ ನ ಭಯಂ ಕಿಂಚನಾಸ್ತಿ' ಎನ್ನುವ ಮಾತಲ್ಲಿ ಬಂದಿರುವ 'ಸ್ವರ್ಗ ಲೋಕ' ಅಂದರೆ ಜೀವರಿಗೆ ತಿಳಿಯುವ ಸಾಮಾನ್ಯ ಇಂದ್ರನ ಲೋಕವಲ್ಲ. ಏಕೆಂದರೆ ಇಲ್ಲಿ 'ನ ಭಯಂ ಕಿಂಚನಾಸ್ತಿ' ಎಂದಿದಾರೆ. ಅಂದರೆ ಇದು ಯಾವದೇ ಭಯವೂ ಇಲ್ಲದ ಸ್ವರ್ಗ ಲೋಕ. ಇಂದ್ರನ ಲೋಕ ಕೇವಲ ಭೋಗಕಾರಕ ಸುಖವನ್ನು ಅನುಭವಿಸಿ ಭೂಮಿಗೆ ಮರಳುವ ಲೋಕ. ಅಲ್ಲಿ ಜೀವರಿಗೂ ಕೂಡಾ ಪತನದ ಭಯವಿರುತ್ತೆ. ಆದ್ದರಿಂದ ಇಲ್ಲಿ ಹೇಳುವ ಸ್ವರ್ಗ ಲೋಕ-ಭಗವಂತನ ಲೋಕವಾದ ವೈಕುಂಠವೇ. ಅಲ್ಲಿ ಮೃತ್ಯುವಿನ ಭಯವಿಲ್ಲ, ಜರಾ-ಮೃತ್ಯುಯ ಭಯವಿಲ್ಲ [ನ ತತ್ರ ತ್ವಂ ನ ಜರಯಾ ಬಿಭೇತಿ]. ಸಹಜವಾಗಿ ಸ್ವರ್ಗ = ಸ್ವ + ರ + ಗ. ಇಲ್ಲಿ 'ಸ್ವಃ' ಅಂದರೆ ಎಲ್ಲಾ ಸ್ವರಗಳಿಂದ ವಾಚ್ಯನಾದ ಭಗವಂತನ ರೂಪ. ಸ್ವರಃ ಅಂದರೆ - ಸ್ವಯಂ ಏವ ರಮತೇ ಇತಿ ಸ್ವರಃ. ಸ್ವಯಂ ಆನಂದಸ್ವರೂಪವಾದ ಭಗವಂತ. ಆತನ ಆನಂದಕ್ಕೆ ಇನ್ನೊಂದು ಸಾಧನ ಅಥವಾ ಅವಲಂಬನವೇ ಬೇಡ. ಇಂತಹ ಭಗವಂತ ಎಲ್ಲಿ ಸದಾ ಗತವಾಗಿ ಇರುತ್ತಾರೋ [ಸದಾ ವಿಕಸಿತವಾಗಿ ಇರುತ್ತಾರೋ] ಅದು ಸ್ವರ್ಗ ಲೋಕ. ಅಂದರೆ ಮುಕ್ತನಾಗಿರುವದು. ಇನ್ನೊಂದು ರೀತಿಯಲ್ಲಿ ಈ ಪದವನ್ನು ಒಡೆದರೆ ಸು+ವ+ಗ = ಸ್ವರ್ಗ. ಇಲ್ಲಿ ಸುವಃ ಅಂದರೆ ಜ್ಞಾನಾನಂದಸ್ವರೂಪವಾದ ಭಗವಂತ. [ಈ ವಿವರಣೆ ತೈತ್ತಿರೀಯದಲ್ಲಿದೆ]. ಅಂತಹ ಭಗವಂತ ಗತವಾದ ಲೋಕ ಸ್ವರ್ಗ ಲೋಕ-ಅದು ವೈಕುಂಠವೇ. ಈ ಅರ್ಥವನ್ನು ತಿಳಿದು ಈ ಶ್ಲೋಕವನ್ನು ನೋಡೋಣ.</w:t>
-      </w:r>
-    </w:p>
-    <w:p>
-      <w:pPr>
-        <w:spacing w:line="276" w:lineRule="auto" w:after="120"/>
-      </w:pPr>
-      <w:r>
-        <w:t>ಯಮನ ಅನುಗ್ರಹಕ್ಕೆ ಸಂತೋಷಪಟ್ಟ ನಚಿಕೇತ ಮುಂದುವರಿದು ಹೇಳುತ್ತಾ: 'ಯಾವದೇ ಮೃತ್ಯುವಿನ ಭಯವಿಲ್ಲ. ಅಲ್ಲಿ ಹುಟ್ಟು-ಸಾವಿನ ನಡುವಿನ ತರಂಗಗಳಾದ ಕಳೇಬರ, ಹಸಿವು, ಬಾಯಾರ, ಮುಪ್ಪು, ರೋಗ ಯಾವದೂ ಇಲ್ಲ. ಎಲ್ಲರೂ ಆನಂದವಾಗಿ ಇರುತ್ತಾರೆ ಎಂದು ನೋಡೀಯೇ. ಸ್ವರ್ಗ ಲೋಕ ವಾಸಿಸುವ ಅಲ್ಲಿಂದ ವೈಕುಂಠ ಯೋಗಕ್ಕೇ ಒಳಗಾದ ಸ್ವರ್ಗ ನಾಮಕವಾದ ಮತ್ತು ಅಭಿಷಕ್ತನಾದ ಭಗವಂತನನ್ನು ತಿಳಿದುಕೊಳ್ಳಬೇಕು ಎನ್ನುವ ಆಕಾಂಕ್ಷೆಯೂ. ನೀನು ಯಾವ ಪ್ರಧಾನವಾದ ನಾರಾಯಣನನ್ನು ಉಪಾಸಿಸಿ ಅರಿಯುತಿಯೋ. ಈ ಅಭಿಷಕ್ತನಾದ ಭಗವಂತನನ್ನು ನಾನು ಯಾವ ರೀತಿ ಉಪಾಸಿಸಬೇಕು-ಅದನ್ನು ಹೇಳು. ನನಗೆ ಶ್ರದ್ಧೆ ಇದೆ. ನಾನು ಶ್ರದ್ಧೆಯಿಂದ ಕೇಳುತ್ತೀನೆ. ಭಗವಂತ ಎಂಬ ಅಮೃತತ್ವವನ್ನು ಉಪಾಸಿಸಿ, ಸ್ವರ್ಗವನ್ನು ಯಾರು ಅಭಿಸಲು ಶಕ್ತರು ಆಗಿರುತ್ತಾರೋ, ಆ ಜನರೇ ವೈಕುಂಠವನ್ನು ಸೇರುತ್ತಾರೆ ಎನ್ನುವದನ್ನು ತಿಳಿದವರು ಹೇಳುತ್ತಾರೆ. ಯಾವ ಸಾಧನದಿಂದ ಉಪಾಸಿಸಬೇಕಾದ ಭಗವಂತನನ್ನು ಅಗ್ನಿ ಮುಖದಲ್ಲಿ ಹೇಗೆ ಉಪಾಸಿಸಬೇಕು ಮತ್ತು ಹೇಗೆ ಮಾಡಬೇಕು. ಅಗ್ನಿ ಮುಖದಲ್ಲಿ ಆರಾಧನೆ ಮಾಡುವ, ಅದರ ಹಿಂದಿನ ಜ್ಞಾನ ಮತ್ತು ಉಪಾಸಿತವ್ಯದ ರಹಸ್ಯವನ್ನು ನನಗೆ ಹೇಳು' ಎಂದು ನಚಿಕೇತ ತನ್ನ ಎರಡನೇ ವರವನ್ನು ಯಮನಿಗೆ ಹೇಳುತ್ತಾರೆ.</w:t>
-      </w:r>
-    </w:p>
-    <w:p>
-      <w:pPr>
-        <w:spacing w:line="276" w:lineRule="auto" w:after="120"/>
-      </w:pPr>
-      <w:r>
-        <w:t>ಇಲ್ಲಿ ನಚಿಕೇತ 'ನನಗೆ ಶ್ರದ್ಧೆ ಇದೆ, ನಾನು ಶ್ರದ್ಧೆಯಿಂದ ಕೇಳುತ್ತೀನೆ' ಎಂದಿದಾರೆ. ಸಂಸ್ಕೃತದ 'ಶ್ರದ್ಧಾ' ಎನ್ನುವ ಶಬ್ದಕ್ಕೆ ಅಪೂರ್ವವಾದ ಅರ್ಥವಿದೆ. 'ಶ್ರದ್ಧಾ' ಎಂದರೆ ಆಸ್ತಿಕ. ಆಸ್ತಿಕ ಅಂದರೆ ನಮಗೆ</w:t>
+        <w:t>ಸ್ವರ್ಗೇ ಲೋಕೇ ನ ಭಯಂ ಕಿಂಚನಾಸ್ತಿ ನ ತತ್ರ ತ್ವಂ ನ ಜರಯಾ ಬಿಭೇತಿ |</w:t>
+      </w:r>
+    </w:p>
+    <w:p>
+      <w:pPr>
+        <w:spacing w:line="276" w:lineRule="auto" w:after="120"/>
+      </w:pPr>
+      <w:r>
+        <w:t>ಉಭೇ ತೀರ್ತ್ವಾ ಅಶನಾಯಾಪಿಪಾಸೇ ಶೋಕಾತಿಗೋ ಮೋದತೇ ಸ್ವರ್ಗಲೋಕೇ ॥೧೨॥</w:t>
+      </w:r>
+    </w:p>
+    <w:p>
+      <w:pPr>
+        <w:spacing w:line="276" w:lineRule="auto" w:after="120"/>
+      </w:pPr>
+      <w:r>
+        <w:t>ಸ ತ್ವಮಗ್ನಿಂ ಸ್ವರ್ಗ್ಯಮಧ್ಯೇಷಿ ಮೃತ್ಯೋ ಪ್ರಬ್ರೂಹಿ ತ್ವಂ ಶ್ರದ್ದಧಾನಾಯ ಮಹ್ಯಂ |</w:t>
+      </w:r>
+    </w:p>
+    <w:p>
+      <w:pPr>
+        <w:spacing w:line="276" w:lineRule="auto" w:after="120"/>
+      </w:pPr>
+      <w:r>
+        <w:t>ಸ್ವರ್ಗಲೋಕಾ ಅಮೃತತ್ವಂ ಭಜಂತ ಏತದ್ ದ್ವಿತೀಯೇನ ವೃಣೇ ವರೇಣ ॥೧೩॥</w:t>
+      </w:r>
+    </w:p>
+    <w:p>
+      <w:pPr>
+        <w:spacing w:line="276" w:lineRule="auto" w:after="120"/>
+      </w:pPr>
+      <w:r>
+        <w:t>ಇಲ್ಲಿ “ಸ್ವರ್ಗೇ ಲೋಕೇ ನ ಭಯಂ ಕಿಂಚನಾಸ್ತಿ” ಎನ್ನುವಲ್ಲಿ ಬಂದಿರುವ ‘ಸ್ವರ್ಗ ಲೋಕ’ ಅಂದರೆ ದೇವತೆಗಳಿರುವ ದೇವೇಂದ್ರನ ಲೋಕವಲ್ಲ. ಏಕೆಂದರೆ ಇಲ್ಲಿ ‘ನ ಭಯಂ ಕಿಂಚನಾಸ್ತಿ’ ಎಂದಿದ್ದಾರೆ. ಅಂದರೆ ಇದು ಯಾವ ಭಯವೂ ಇಲ್ಲದ ಸ್ವರ್ಗಲೋಕ. ದೇವೇಂದ್ರನ ಲೋಕ ಕೇವಲ ತಾತ್ಕಾಲಿಕ ಸುಖವನ್ನು ಅನುಭವಿಸಿ ಭೂಮಿಗೆ ಮರಳುವ ಲೋಕ. ಅಲ್ಲಿ ದೇವತೆಗಳಿಗೂ ಕೂಡ ಪತನದ ಭಯವಿದೆ. ಆದ್ದರಿಂದ ಇಲ್ಲಿ ಹೇಳುವ ಸ್ವರ್ಗಲೋಕ-ಭಗವಂತನ ಲೋಕವಾದ ಮೋಕ್ಷ. ಮೋಕ್ಷದಲ್ಲಿ ಮೃತ್ಯುವಿನ ಭಯವಿಲ್ಲ, ಜರಾ-ವ್ಯಾಧಿಯ ಭಯವಿಲ್ಲ [ನ ತತ್ರ ತ್ವಂ ನ ಜರಯಾ ಬಿಭೇತಿ]. ಸಹಜವಾಗಿ ಸ್ವರ್ಗ=ಸ್ವ+ರ+ಗ. ಇಲ್ಲಿ ‘ಸ್ವಃ’ ಅಂದರೆ ಎಲ್ಲಾ ಸ್ವರಗಳಿಂದ ವಾಚ್ಯನಾದ ಭಗವಂತನ ರೂಪ. ಸ್ವರಃ ಅಂದರೆ-ಸ್ವಯಮೇವ ರಮತಿ ಇತಿ ಸ್ವರಃ. ಸ್ವಯಂ ಆನಂದಸ್ವರೂಪನಾದ ಭಗವಂತ. ಆತನ ಆನಂದಕ್ಕೆ ಇನ್ನೊಂದು ಸಾಧನ ಅಥವಾ ಅಧಿಷ್ಠಾನ ಬೇಡ. ಇಂತಹ ಭಗವಂತ ಎಲ್ಲಿ ಸದಾ ಗತನಾಗಿದ್ದಾನೋ [ಸದಾ ವ್ಯಕ್ತನಾಗಿರುತ್ತಾನೋ] ಅದು ಸ್ವರ್ಗಲೋಕ. ಅಂದರೆ ಮುಕ್ತಸ್ಥಾನ. ಇನ್ನೊಂದು ರೀತಿಯಲ್ಲಿ ಈ ಪದವನ್ನು ಬಿಡಿಸಿದರೆ ಸು+ವ+ರ್ಗ=ಸ್ವರ್ಗ. ಇಲ್ಲಿ ಸುವಃ ಅಂದರೆ ಜ್ಞಾನಾನಂದಸ್ವರೂಪನಾದ ಭಗವಂತ. [ಈ ವಿವರಣೆ ಗಾಯತ್ರಿಯಲ್ಲಿದೆ]. ಅಂತಹ ಭಗವಂತ ಗತನಾದ ಲೋಕ ಸ್ವರ್ಗಲೋಕ-ಅದು ಮೋಕ್ಷ ಸ್ಥಾನ. ಈ ಹಿನ್ನೆಲೆಯನ್ನು ತಿಳಿದು ಈ ಶ್ಲೋಕವನ್ನು ವಿಶ್ಲೇಷಿಸೋಣ.</w:t>
+      </w:r>
+    </w:p>
+    <w:p>
+      <w:pPr>
+        <w:spacing w:line="276" w:lineRule="auto" w:after="120"/>
+      </w:pPr>
+      <w:r>
+        <w:t>ಯಮನ ಅನುಗ್ರಹಕ್ಕೆ ಪಾತ್ರನಾದ ನಚಿಕೇತ ಮುಂದುವರಿದು ಹೇಳುತ್ತಾನೆ: “ಮೋಕ್ಷದಲ್ಲಿ ಸಾವಿನ ಭಯವಿಲ್ಲ. ಅಲ್ಲಿ ಹುಟ್ಟು ಸಾವಿನ ನಡುವಿನ ತರಂಗಗಳಾದ ಶೋಕ, ಮೋಹ, ಹಸಿವು, ಬಾಯಾರಿಕೆ, ಮುಪ್ಪು, ರೋಗ ಯಾವುದೂ ಇಲ್ಲದೆ ಎಲ್ಲರೂ ಆನಂದವಾಗಿರುತ್ತಾರೆ ಎಂದು ಕೇಳಿದ್ದೇನೆ. ಸ್ವರ್ಗಲೋಕಕ್ಕೆ ಹೋಗಿ ಅಲ್ಲಿಂದ ವೈಕುಂಠಕ್ಕೆ ಹೋಗಬೇಕಾದರೆ ಸ್ವರ್ಗ ನಿಯಾಮಕನಾದ ಮತ್ತು ಅಗ್ನಿಸ್ಥನಾದ ಭಗವಂತನನ್ನು ತಿಳಿದುಕೊಳ್ಳಬೇಕು ಎನ್ನುವ ವಿಚಾರ ಗೊತ್ತಿದೆ. ನೀನು ಮೋಕ್ಷಪ್ರದನಾದ ನಾರಾಯಣನನ್ನು ಉಪಾಸನೆ ಮಾಡಿದ್ದೀಯೆ. ಈ ಅಗ್ನಿಸ್ಥನಾದ ಭಗವಂತನನ್ನು ನಾನು ಹೇಗೆ ಉಪಾಸನೆ ಮಾಡಬೇಕು-ಅದನ್ನು ಹೇಳು. ನನಗೆ ಶ್ರದ್ಧೆ ಇದೆ. ನಾನು ಶ್ರದ್ಧೆಯಿಂದ ಕೇಳುತ್ತಿದ್ದೇನೆ. ಭಗವಂತನೆಂಬ ಅಮೃತತ್ವವನ್ನು ಉಪಾಸನೆ ಮಾಡಿ, ಸ್ವರ್ಗವನ್ನು ಸೇರಿ ಅಲ್ಲಿ ಸ್ವಲ್ಪ ಕಾಲ ಇದ್ದು, ಆಮೇಲೆ ವೈಕುಂಠವನ್ನು ಸೇರುತ್ತಾರೆ ಎನ್ನುವುದನ್ನು ತಿಳಿದವರು ಹೇಳುತ್ತಾರೆ. ಮೋಕ್ಷ ಸಾಧನೆಗಾಗಿ ಉಪಾಸನೆ ಮಾಡಬೇಕಾದ ಭಗವಂತನನ್ನು ಅಗ್ನಿ ಮುಖದಲ್ಲೇ ಏಕೆ ಉಪಾಸನೆ ಮಾಡಬೇಕು ಮತ್ತು ಹೇಗೆ ಮಾಡಬೇಕು. ಅಗ್ನಿಮುಖದಲ್ಲಿ ಆರಾಧನೆ ಮಾಡುವ, ಅದರ ಹಿಂದಿನ ಜ್ಞಾನ ಮತ್ತು ಉಪಾಸನೆಯ ರಹಸ್ಯವನ್ನು ನನಗೆ ಹೇಳು” ಎಂದು ನಚಿಕೇತ ತನ್ನ ಎರಡನೇ ವರವನ್ನು ಯಮನಲ್ಲಿ ಕೇಳುತ್ತಾನೆ.</w:t>
+      </w:r>
+    </w:p>
+    <w:p>
+      <w:pPr>
+        <w:spacing w:line="276" w:lineRule="auto" w:after="120"/>
+      </w:pPr>
+      <w:r>
+        <w:t>ಇಲ್ಲಿ ನಚಿಕೇತ ‘ನನಗೆ ಶ್ರದ್ಧೆ ಇದೆ, ನಾನು ಶ್ರದ್ಧೆಯಿಂದ ಕೇಳುತ್ತಿದ್ದೇನೆ’ ಎಂದಿದ್ದಾನೆ. ಸಂಸ್ಕೃತದಲ್ಲಿ ‘ಶ್ರದ್ಧಾ’ ಎನ್ನುವ ಶಬ್ದಕ್ಕೆ ಅಪೂರ್ವವಾದ ಅರ್ಥವಿದೆ. ‘ಶ್ರತ್’ ಎಂದರೆ ಆಸ್ತಿಕ್ಯ. ಆಸ್ತಿಕ್ಯ ಅಂದರೆ ನಮಗೆ</w:t>
       </w:r>
     </w:p>
     <w:p>
@@ -1365,7 +1349,7 @@
           <w:i/>
           <w:sz w:val="20"/>
         </w:rPr>
-        <w:t>ಆಧಾರ: ಬನ್ನಂಜೆ ಗೋವಿಂದಾಚಾರ್ಯ ಉಪನಿಷತ್ ಪ್ರವಚನ    Page 14</w:t>
+        <w:t>ಆಧಾರ: ಬನ್ನಂಜೆ ಗೋವಿಂದಾಚಾರ್ಯರ ಉಪನಿಷತ್ ಪ್ರವಚನ Page 14</w:t>
       </w:r>
     </w:p>
     <w:p>

</xml_diff>